<commit_message>
Se agrega avances de actividades de PAMH
</commit_message>
<xml_diff>
--- a/Cuaderno_ingenieria/equipo_b.docx
+++ b/Cuaderno_ingenieria/equipo_b.docx
@@ -101,7 +101,7 @@
                 <w:noProof/>
               </w:rPr>
               <w:drawing>
-                <wp:inline distT="0" distB="0" distL="0" distR="0" wp14:anchorId="19B9134C" wp14:editId="6459CFD5">
+                <wp:inline distT="0" distB="0" distL="0" distR="0" wp14:anchorId="4D347F99" wp14:editId="7210017F">
                   <wp:extent cx="2276475" cy="361950"/>
                   <wp:effectExtent l="0" t="0" r="0" b="0"/>
                   <wp:docPr id="1288723972" name="drawing"/>
@@ -191,7 +191,7 @@
                 <w:sz w:val="22"/>
                 <w:szCs w:val="22"/>
               </w:rPr>
-              <w:t>#</w:t>
+              <w:t>B</w:t>
             </w:r>
           </w:p>
         </w:tc>
@@ -245,49 +245,49 @@
                 <w:sz w:val="22"/>
                 <w:szCs w:val="22"/>
               </w:rPr>
-              <w:t>#</w:t>
-            </w:r>
-          </w:p>
-          <w:p>
-            <w:pPr>
-              <w:spacing w:after="0"/>
-              <w:jc w:val="center"/>
-              <w:rPr>
-                <w:rFonts w:ascii="Arial" w:eastAsia="Arial" w:hAnsi="Arial" w:cs="Arial"/>
-                <w:color w:val="000000" w:themeColor="text1"/>
-                <w:sz w:val="22"/>
-                <w:szCs w:val="22"/>
-              </w:rPr>
-            </w:pPr>
-            <w:r>
-              <w:rPr>
-                <w:rFonts w:ascii="Arial" w:eastAsia="Arial" w:hAnsi="Arial" w:cs="Arial"/>
-                <w:color w:val="000000" w:themeColor="text1"/>
-                <w:sz w:val="22"/>
-                <w:szCs w:val="22"/>
-              </w:rPr>
-              <w:t>#</w:t>
-            </w:r>
-          </w:p>
-          <w:p>
-            <w:pPr>
-              <w:spacing w:after="0"/>
-              <w:jc w:val="center"/>
-              <w:rPr>
-                <w:rFonts w:ascii="Arial" w:eastAsia="Arial" w:hAnsi="Arial" w:cs="Arial"/>
-                <w:color w:val="000000" w:themeColor="text1"/>
-                <w:sz w:val="22"/>
-                <w:szCs w:val="22"/>
-              </w:rPr>
-            </w:pPr>
-            <w:r>
-              <w:rPr>
-                <w:rFonts w:ascii="Arial" w:eastAsia="Arial" w:hAnsi="Arial" w:cs="Arial"/>
-                <w:color w:val="000000" w:themeColor="text1"/>
-                <w:sz w:val="22"/>
-                <w:szCs w:val="22"/>
-              </w:rPr>
-              <w:t>#</w:t>
+              <w:t xml:space="preserve">Eric Castro Velázquez </w:t>
+            </w:r>
+          </w:p>
+          <w:p>
+            <w:pPr>
+              <w:spacing w:after="0"/>
+              <w:jc w:val="center"/>
+              <w:rPr>
+                <w:rFonts w:ascii="Arial" w:eastAsia="Arial" w:hAnsi="Arial" w:cs="Arial"/>
+                <w:color w:val="000000" w:themeColor="text1"/>
+                <w:sz w:val="22"/>
+                <w:szCs w:val="22"/>
+              </w:rPr>
+            </w:pPr>
+            <w:r>
+              <w:rPr>
+                <w:rFonts w:ascii="Arial" w:eastAsia="Arial" w:hAnsi="Arial" w:cs="Arial"/>
+                <w:color w:val="000000" w:themeColor="text1"/>
+                <w:sz w:val="22"/>
+                <w:szCs w:val="22"/>
+              </w:rPr>
+              <w:t>Daniel Chavarría García</w:t>
+            </w:r>
+          </w:p>
+          <w:p>
+            <w:pPr>
+              <w:spacing w:after="0"/>
+              <w:jc w:val="center"/>
+              <w:rPr>
+                <w:rFonts w:ascii="Arial" w:eastAsia="Arial" w:hAnsi="Arial" w:cs="Arial"/>
+                <w:color w:val="000000" w:themeColor="text1"/>
+                <w:sz w:val="22"/>
+                <w:szCs w:val="22"/>
+              </w:rPr>
+            </w:pPr>
+            <w:r>
+              <w:rPr>
+                <w:rFonts w:ascii="Arial" w:eastAsia="Arial" w:hAnsi="Arial" w:cs="Arial"/>
+                <w:color w:val="000000" w:themeColor="text1"/>
+                <w:sz w:val="22"/>
+                <w:szCs w:val="22"/>
+              </w:rPr>
+              <w:t>Esteban Segura García</w:t>
             </w:r>
           </w:p>
           <w:p>
@@ -378,16 +378,7 @@
                 <w:sz w:val="22"/>
                 <w:szCs w:val="22"/>
               </w:rPr>
-              <w:t>Aníbal Ruiz</w:t>
-            </w:r>
-            <w:r>
-              <w:rPr>
-                <w:rFonts w:ascii="Arial" w:eastAsia="Arial" w:hAnsi="Arial" w:cs="Arial"/>
-                <w:color w:val="000000" w:themeColor="text1"/>
-                <w:sz w:val="22"/>
-                <w:szCs w:val="22"/>
-              </w:rPr>
-              <w:t xml:space="preserve"> Barquero</w:t>
+              <w:t>Aníbal Ruiz Barquero</w:t>
             </w:r>
           </w:p>
           <w:p>
@@ -478,34 +469,7 @@
                 <w:sz w:val="22"/>
                 <w:szCs w:val="22"/>
               </w:rPr>
-              <w:t>4</w:t>
-            </w:r>
-            <w:r>
-              <w:rPr>
-                <w:rFonts w:ascii="Arial" w:eastAsia="Arial" w:hAnsi="Arial" w:cs="Arial"/>
-                <w:color w:val="000000" w:themeColor="text1"/>
-                <w:sz w:val="22"/>
-                <w:szCs w:val="22"/>
-              </w:rPr>
-              <w:t xml:space="preserve"> de </w:t>
-            </w:r>
-            <w:r>
-              <w:rPr>
-                <w:rFonts w:ascii="Arial" w:eastAsia="Arial" w:hAnsi="Arial" w:cs="Arial"/>
-                <w:color w:val="000000" w:themeColor="text1"/>
-                <w:sz w:val="22"/>
-                <w:szCs w:val="22"/>
-              </w:rPr>
-              <w:t xml:space="preserve">septiembre </w:t>
-            </w:r>
-            <w:r>
-              <w:rPr>
-                <w:rFonts w:ascii="Arial" w:eastAsia="Arial" w:hAnsi="Arial" w:cs="Arial"/>
-                <w:color w:val="000000" w:themeColor="text1"/>
-                <w:sz w:val="22"/>
-                <w:szCs w:val="22"/>
-              </w:rPr>
-              <w:t>del 2025</w:t>
+              <w:t>4 de septiembre del 2025</w:t>
             </w:r>
           </w:p>
         </w:tc>
@@ -569,7 +533,18 @@
                 <w:sz w:val="22"/>
                 <w:szCs w:val="22"/>
               </w:rPr>
-              <w:t xml:space="preserve">#: </w:t>
+              <w:t>1</w:t>
+            </w:r>
+            <w:r>
+              <w:rPr>
+                <w:rFonts w:ascii="Arial" w:eastAsia="Arial" w:hAnsi="Arial" w:cs="Arial"/>
+                <w:b/>
+                <w:bCs/>
+                <w:color w:val="000000" w:themeColor="text1"/>
+                <w:sz w:val="22"/>
+                <w:szCs w:val="22"/>
+              </w:rPr>
+              <w:t xml:space="preserve">: </w:t>
             </w:r>
             <w:proofErr w:type="gramStart"/>
             <w:r>
@@ -581,29 +556,18 @@
                 <w:sz w:val="22"/>
                 <w:szCs w:val="22"/>
               </w:rPr>
-              <w:t>(</w:t>
-            </w:r>
-            <w:r>
-              <w:rPr>
-                <w:rFonts w:ascii="Arial" w:eastAsia="Arial" w:hAnsi="Arial" w:cs="Arial"/>
-                <w:b/>
-                <w:bCs/>
-                <w:color w:val="000000" w:themeColor="text1"/>
-                <w:sz w:val="22"/>
-                <w:szCs w:val="22"/>
-              </w:rPr>
-              <w:t xml:space="preserve"> T</w:t>
-            </w:r>
-            <w:r>
-              <w:rPr>
-                <w:rFonts w:ascii="Arial" w:eastAsia="Arial" w:hAnsi="Arial" w:cs="Arial"/>
-                <w:b/>
-                <w:bCs/>
-                <w:color w:val="000000" w:themeColor="text1"/>
-                <w:sz w:val="22"/>
-                <w:szCs w:val="22"/>
-              </w:rPr>
-              <w:t>itulo</w:t>
+              <w:t xml:space="preserve">( </w:t>
+            </w:r>
+            <w:r>
+              <w:rPr>
+                <w:rFonts w:ascii="Arial" w:eastAsia="Arial" w:hAnsi="Arial" w:cs="Arial"/>
+                <w:b/>
+                <w:bCs/>
+                <w:color w:val="000000" w:themeColor="text1"/>
+                <w:sz w:val="22"/>
+                <w:szCs w:val="22"/>
+              </w:rPr>
+              <w:t>Motor</w:t>
             </w:r>
             <w:proofErr w:type="gramEnd"/>
             <w:r>
@@ -615,7 +579,18 @@
                 <w:sz w:val="22"/>
                 <w:szCs w:val="22"/>
               </w:rPr>
-              <w:t xml:space="preserve"> del laboratorio)</w:t>
+              <w:t xml:space="preserve"> CD</w:t>
+            </w:r>
+            <w:r>
+              <w:rPr>
+                <w:rFonts w:ascii="Arial" w:eastAsia="Arial" w:hAnsi="Arial" w:cs="Arial"/>
+                <w:b/>
+                <w:bCs/>
+                <w:color w:val="000000" w:themeColor="text1"/>
+                <w:sz w:val="22"/>
+                <w:szCs w:val="22"/>
+              </w:rPr>
+              <w:t>)</w:t>
             </w:r>
           </w:p>
         </w:tc>
@@ -688,6 +663,9 @@
         </w:tc>
       </w:tr>
     </w:tbl>
+    <w:p/>
+    <w:p/>
+    <w:p/>
     <w:p/>
     <w:p>
       <w:r>
@@ -794,10 +772,10 @@
                 <w:noProof/>
               </w:rPr>
               <w:drawing>
-                <wp:inline distT="0" distB="0" distL="0" distR="0" wp14:anchorId="3A234E89" wp14:editId="22C04056">
+                <wp:inline distT="0" distB="0" distL="0" distR="0" wp14:anchorId="4DE8D8AA" wp14:editId="78CCD842">
                   <wp:extent cx="2276475" cy="361950"/>
                   <wp:effectExtent l="0" t="0" r="0" b="0"/>
-                  <wp:docPr id="1149776737" name="drawing"/>
+                  <wp:docPr id="754569719" name="drawing"/>
                   <wp:cNvGraphicFramePr>
                     <a:graphicFrameLocks xmlns:a="http://schemas.openxmlformats.org/drawingml/2006/main" noChangeAspect="1"/>
                   </wp:cNvGraphicFramePr>
@@ -873,7 +851,18 @@
                 <w:sz w:val="22"/>
                 <w:szCs w:val="22"/>
               </w:rPr>
-              <w:t>Cuaderno de Ingeniería - Grupo #</w:t>
+              <w:t xml:space="preserve">Cuaderno de Ingeniería - Grupo </w:t>
+            </w:r>
+            <w:r>
+              <w:rPr>
+                <w:rFonts w:ascii="Arial" w:eastAsia="Arial" w:hAnsi="Arial" w:cs="Arial"/>
+                <w:b/>
+                <w:bCs/>
+                <w:color w:val="000000" w:themeColor="text1"/>
+                <w:sz w:val="22"/>
+                <w:szCs w:val="22"/>
+              </w:rPr>
+              <w:t>B</w:t>
             </w:r>
           </w:p>
         </w:tc>
@@ -927,49 +916,49 @@
                 <w:sz w:val="22"/>
                 <w:szCs w:val="22"/>
               </w:rPr>
-              <w:t>#</w:t>
-            </w:r>
-          </w:p>
-          <w:p>
-            <w:pPr>
-              <w:spacing w:after="0"/>
-              <w:jc w:val="center"/>
-              <w:rPr>
-                <w:rFonts w:ascii="Arial" w:eastAsia="Arial" w:hAnsi="Arial" w:cs="Arial"/>
-                <w:color w:val="000000" w:themeColor="text1"/>
-                <w:sz w:val="22"/>
-                <w:szCs w:val="22"/>
-              </w:rPr>
-            </w:pPr>
-            <w:r>
-              <w:rPr>
-                <w:rFonts w:ascii="Arial" w:eastAsia="Arial" w:hAnsi="Arial" w:cs="Arial"/>
-                <w:color w:val="000000" w:themeColor="text1"/>
-                <w:sz w:val="22"/>
-                <w:szCs w:val="22"/>
-              </w:rPr>
-              <w:t>#</w:t>
-            </w:r>
-          </w:p>
-          <w:p>
-            <w:pPr>
-              <w:spacing w:after="0"/>
-              <w:jc w:val="center"/>
-              <w:rPr>
-                <w:rFonts w:ascii="Arial" w:eastAsia="Arial" w:hAnsi="Arial" w:cs="Arial"/>
-                <w:color w:val="000000" w:themeColor="text1"/>
-                <w:sz w:val="22"/>
-                <w:szCs w:val="22"/>
-              </w:rPr>
-            </w:pPr>
-            <w:r>
-              <w:rPr>
-                <w:rFonts w:ascii="Arial" w:eastAsia="Arial" w:hAnsi="Arial" w:cs="Arial"/>
-                <w:color w:val="000000" w:themeColor="text1"/>
-                <w:sz w:val="22"/>
-                <w:szCs w:val="22"/>
-              </w:rPr>
-              <w:t>#</w:t>
+              <w:t xml:space="preserve">Eric Castro Velázquez </w:t>
+            </w:r>
+          </w:p>
+          <w:p>
+            <w:pPr>
+              <w:spacing w:after="0"/>
+              <w:jc w:val="center"/>
+              <w:rPr>
+                <w:rFonts w:ascii="Arial" w:eastAsia="Arial" w:hAnsi="Arial" w:cs="Arial"/>
+                <w:color w:val="000000" w:themeColor="text1"/>
+                <w:sz w:val="22"/>
+                <w:szCs w:val="22"/>
+              </w:rPr>
+            </w:pPr>
+            <w:r>
+              <w:rPr>
+                <w:rFonts w:ascii="Arial" w:eastAsia="Arial" w:hAnsi="Arial" w:cs="Arial"/>
+                <w:color w:val="000000" w:themeColor="text1"/>
+                <w:sz w:val="22"/>
+                <w:szCs w:val="22"/>
+              </w:rPr>
+              <w:t>Daniel Chavarría García</w:t>
+            </w:r>
+          </w:p>
+          <w:p>
+            <w:pPr>
+              <w:spacing w:after="0"/>
+              <w:jc w:val="center"/>
+              <w:rPr>
+                <w:rFonts w:ascii="Arial" w:eastAsia="Arial" w:hAnsi="Arial" w:cs="Arial"/>
+                <w:color w:val="000000" w:themeColor="text1"/>
+                <w:sz w:val="22"/>
+                <w:szCs w:val="22"/>
+              </w:rPr>
+            </w:pPr>
+            <w:r>
+              <w:rPr>
+                <w:rFonts w:ascii="Arial" w:eastAsia="Arial" w:hAnsi="Arial" w:cs="Arial"/>
+                <w:color w:val="000000" w:themeColor="text1"/>
+                <w:sz w:val="22"/>
+                <w:szCs w:val="22"/>
+              </w:rPr>
+              <w:t>Esteban Segura García</w:t>
             </w:r>
           </w:p>
           <w:p>
@@ -1204,31 +1193,29 @@
                 <w:sz w:val="22"/>
                 <w:szCs w:val="22"/>
               </w:rPr>
-              <w:t xml:space="preserve">Laboratorio #: </w:t>
-            </w:r>
-            <w:proofErr w:type="gramStart"/>
-            <w:r>
-              <w:rPr>
-                <w:rFonts w:ascii="Arial" w:eastAsia="Arial" w:hAnsi="Arial" w:cs="Arial"/>
-                <w:b/>
-                <w:bCs/>
-                <w:color w:val="000000" w:themeColor="text1"/>
-                <w:sz w:val="22"/>
-                <w:szCs w:val="22"/>
-              </w:rPr>
-              <w:t>( Titulo</w:t>
-            </w:r>
-            <w:proofErr w:type="gramEnd"/>
-            <w:r>
-              <w:rPr>
-                <w:rFonts w:ascii="Arial" w:eastAsia="Arial" w:hAnsi="Arial" w:cs="Arial"/>
-                <w:b/>
-                <w:bCs/>
-                <w:color w:val="000000" w:themeColor="text1"/>
-                <w:sz w:val="22"/>
-                <w:szCs w:val="22"/>
-              </w:rPr>
-              <w:t xml:space="preserve"> del laboratorio)</w:t>
+              <w:t>Laboratorio #: (</w:t>
+            </w:r>
+            <w:r>
+              <w:rPr>
+                <w:rFonts w:ascii="Arial" w:eastAsia="Arial" w:hAnsi="Arial" w:cs="Arial"/>
+                <w:b/>
+                <w:bCs/>
+                <w:color w:val="000000" w:themeColor="text1"/>
+                <w:sz w:val="22"/>
+                <w:szCs w:val="22"/>
+              </w:rPr>
+              <w:t>Motor CD</w:t>
+            </w:r>
+            <w:r>
+              <w:rPr>
+                <w:rFonts w:ascii="Arial" w:eastAsia="Arial" w:hAnsi="Arial" w:cs="Arial"/>
+                <w:b/>
+                <w:bCs/>
+                <w:color w:val="000000" w:themeColor="text1"/>
+                <w:sz w:val="22"/>
+                <w:szCs w:val="22"/>
+              </w:rPr>
+              <w:t>)</w:t>
             </w:r>
           </w:p>
         </w:tc>
@@ -1296,7 +1283,2839 @@
           <w:p>
             <w:pPr>
               <w:spacing w:after="0"/>
-            </w:pPr>
+              <w:rPr>
+                <w:u w:val="single"/>
+              </w:rPr>
+            </w:pPr>
+          </w:p>
+        </w:tc>
+      </w:tr>
+    </w:tbl>
+    <w:p/>
+    <w:p>
+      <w:r>
+        <w:br w:type="page"/>
+      </w:r>
+    </w:p>
+    <w:tbl>
+      <w:tblPr>
+        <w:tblW w:w="0" w:type="auto"/>
+        <w:tblLayout w:type="fixed"/>
+        <w:tblLook w:val="06A0" w:firstRow="1" w:lastRow="0" w:firstColumn="1" w:lastColumn="0" w:noHBand="1" w:noVBand="1"/>
+      </w:tblPr>
+      <w:tblGrid>
+        <w:gridCol w:w="4559"/>
+        <w:gridCol w:w="4649"/>
+      </w:tblGrid>
+      <w:tr>
+        <w:trPr>
+          <w:trHeight w:val="975"/>
+        </w:trPr>
+        <w:tc>
+          <w:tcPr>
+            <w:tcW w:w="4559" w:type="dxa"/>
+            <w:tcBorders>
+              <w:top w:val="single" w:sz="8" w:space="0" w:color="000000" w:themeColor="text1"/>
+              <w:left w:val="single" w:sz="8" w:space="0" w:color="000000" w:themeColor="text1"/>
+              <w:bottom w:val="single" w:sz="8" w:space="0" w:color="000000" w:themeColor="text1"/>
+              <w:right w:val="single" w:sz="8" w:space="0" w:color="000000" w:themeColor="text1"/>
+            </w:tcBorders>
+            <w:tcMar>
+              <w:top w:w="100" w:type="dxa"/>
+              <w:left w:w="100" w:type="dxa"/>
+              <w:bottom w:w="100" w:type="dxa"/>
+              <w:right w:w="100" w:type="dxa"/>
+            </w:tcMar>
+          </w:tcPr>
+          <w:p>
+            <w:pPr>
+              <w:spacing w:after="0"/>
+              <w:jc w:val="center"/>
+            </w:pPr>
+            <w:r>
+              <w:rPr>
+                <w:rFonts w:ascii="Arial" w:eastAsia="Arial" w:hAnsi="Arial" w:cs="Arial"/>
+                <w:b/>
+                <w:bCs/>
+                <w:color w:val="000000" w:themeColor="text1"/>
+                <w:sz w:val="22"/>
+                <w:szCs w:val="22"/>
+              </w:rPr>
+              <w:lastRenderedPageBreak/>
+              <w:t>Tecnológico de Costa Rica</w:t>
+            </w:r>
+          </w:p>
+          <w:p>
+            <w:pPr>
+              <w:spacing w:after="0"/>
+              <w:jc w:val="center"/>
+              <w:rPr>
+                <w:rFonts w:ascii="Arial" w:eastAsia="Arial" w:hAnsi="Arial" w:cs="Arial"/>
+                <w:b/>
+                <w:bCs/>
+                <w:color w:val="000000" w:themeColor="text1"/>
+                <w:sz w:val="22"/>
+                <w:szCs w:val="22"/>
+              </w:rPr>
+            </w:pPr>
+            <w:r>
+              <w:rPr>
+                <w:rFonts w:ascii="Arial" w:eastAsia="Arial" w:hAnsi="Arial" w:cs="Arial"/>
+                <w:b/>
+                <w:bCs/>
+                <w:color w:val="000000" w:themeColor="text1"/>
+                <w:sz w:val="22"/>
+                <w:szCs w:val="22"/>
+              </w:rPr>
+              <w:t>Laboratorio de Control Automático</w:t>
+            </w:r>
+          </w:p>
+        </w:tc>
+        <w:tc>
+          <w:tcPr>
+            <w:tcW w:w="4649" w:type="dxa"/>
+            <w:tcBorders>
+              <w:top w:val="single" w:sz="8" w:space="0" w:color="000000" w:themeColor="text1"/>
+              <w:left w:val="single" w:sz="8" w:space="0" w:color="000000" w:themeColor="text1"/>
+              <w:bottom w:val="single" w:sz="8" w:space="0" w:color="000000" w:themeColor="text1"/>
+              <w:right w:val="single" w:sz="8" w:space="0" w:color="000000" w:themeColor="text1"/>
+            </w:tcBorders>
+            <w:tcMar>
+              <w:top w:w="100" w:type="dxa"/>
+              <w:left w:w="100" w:type="dxa"/>
+              <w:bottom w:w="100" w:type="dxa"/>
+              <w:right w:w="100" w:type="dxa"/>
+            </w:tcMar>
+          </w:tcPr>
+          <w:p>
+            <w:pPr>
+              <w:spacing w:after="0"/>
+              <w:jc w:val="center"/>
+            </w:pPr>
+            <w:r>
+              <w:rPr>
+                <w:noProof/>
+              </w:rPr>
+              <w:drawing>
+                <wp:inline distT="0" distB="0" distL="0" distR="0" wp14:anchorId="245E6DCF" wp14:editId="55A76574">
+                  <wp:extent cx="2276475" cy="361950"/>
+                  <wp:effectExtent l="0" t="0" r="0" b="0"/>
+                  <wp:docPr id="1853994100" name="drawing"/>
+                  <wp:cNvGraphicFramePr>
+                    <a:graphicFrameLocks xmlns:a="http://schemas.openxmlformats.org/drawingml/2006/main" noChangeAspect="1"/>
+                  </wp:cNvGraphicFramePr>
+                  <a:graphic xmlns:a="http://schemas.openxmlformats.org/drawingml/2006/main">
+                    <a:graphicData uri="http://schemas.openxmlformats.org/drawingml/2006/picture">
+                      <pic:pic xmlns:pic="http://schemas.openxmlformats.org/drawingml/2006/picture">
+                        <pic:nvPicPr>
+                          <pic:cNvPr id="1288723972" name=""/>
+                          <pic:cNvPicPr/>
+                        </pic:nvPicPr>
+                        <pic:blipFill>
+                          <a:blip r:embed="rId4">
+                            <a:extLst>
+                              <a:ext uri="{28A0092B-C50C-407E-A947-70E740481C1C}">
+                                <a14:useLocalDpi xmlns:a14="http://schemas.microsoft.com/office/drawing/2010/main" val="0"/>
+                              </a:ext>
+                            </a:extLst>
+                          </a:blip>
+                          <a:stretch>
+                            <a:fillRect/>
+                          </a:stretch>
+                        </pic:blipFill>
+                        <pic:spPr>
+                          <a:xfrm>
+                            <a:off x="0" y="0"/>
+                            <a:ext cx="2276475" cy="361950"/>
+                          </a:xfrm>
+                          <a:prstGeom prst="rect">
+                            <a:avLst/>
+                          </a:prstGeom>
+                        </pic:spPr>
+                      </pic:pic>
+                    </a:graphicData>
+                  </a:graphic>
+                </wp:inline>
+              </w:drawing>
+            </w:r>
+          </w:p>
+        </w:tc>
+      </w:tr>
+      <w:tr>
+        <w:trPr>
+          <w:trHeight w:val="540"/>
+        </w:trPr>
+        <w:tc>
+          <w:tcPr>
+            <w:tcW w:w="9208" w:type="dxa"/>
+            <w:gridSpan w:val="2"/>
+            <w:tcBorders>
+              <w:top w:val="single" w:sz="8" w:space="0" w:color="000000" w:themeColor="text1"/>
+              <w:left w:val="single" w:sz="8" w:space="0" w:color="000000" w:themeColor="text1"/>
+              <w:bottom w:val="single" w:sz="8" w:space="0" w:color="000000" w:themeColor="text1"/>
+              <w:right w:val="single" w:sz="8" w:space="0" w:color="000000" w:themeColor="text1"/>
+            </w:tcBorders>
+            <w:tcMar>
+              <w:top w:w="100" w:type="dxa"/>
+              <w:left w:w="100" w:type="dxa"/>
+              <w:bottom w:w="100" w:type="dxa"/>
+              <w:right w:w="100" w:type="dxa"/>
+            </w:tcMar>
+          </w:tcPr>
+          <w:p>
+            <w:pPr>
+              <w:spacing w:after="0"/>
+              <w:jc w:val="center"/>
+            </w:pPr>
+            <w:r>
+              <w:rPr>
+                <w:rFonts w:ascii="Arial" w:eastAsia="Arial" w:hAnsi="Arial" w:cs="Arial"/>
+                <w:b/>
+                <w:bCs/>
+                <w:color w:val="000000" w:themeColor="text1"/>
+                <w:sz w:val="22"/>
+                <w:szCs w:val="22"/>
+              </w:rPr>
+              <w:t xml:space="preserve">Cuaderno de Ingeniería - Grupo </w:t>
+            </w:r>
+            <w:r>
+              <w:rPr>
+                <w:rFonts w:ascii="Arial" w:eastAsia="Arial" w:hAnsi="Arial" w:cs="Arial"/>
+                <w:b/>
+                <w:bCs/>
+                <w:color w:val="000000" w:themeColor="text1"/>
+                <w:sz w:val="22"/>
+                <w:szCs w:val="22"/>
+              </w:rPr>
+              <w:t>B</w:t>
+            </w:r>
+          </w:p>
+        </w:tc>
+      </w:tr>
+      <w:tr>
+        <w:trPr>
+          <w:trHeight w:val="2280"/>
+        </w:trPr>
+        <w:tc>
+          <w:tcPr>
+            <w:tcW w:w="4559" w:type="dxa"/>
+            <w:tcBorders>
+              <w:top w:val="single" w:sz="8" w:space="0" w:color="000000" w:themeColor="text1"/>
+              <w:left w:val="single" w:sz="8" w:space="0" w:color="000000" w:themeColor="text1"/>
+              <w:bottom w:val="single" w:sz="8" w:space="0" w:color="000000" w:themeColor="text1"/>
+              <w:right w:val="single" w:sz="8" w:space="0" w:color="000000" w:themeColor="text1"/>
+            </w:tcBorders>
+            <w:tcMar>
+              <w:top w:w="100" w:type="dxa"/>
+              <w:left w:w="100" w:type="dxa"/>
+              <w:bottom w:w="100" w:type="dxa"/>
+              <w:right w:w="100" w:type="dxa"/>
+            </w:tcMar>
+          </w:tcPr>
+          <w:p>
+            <w:pPr>
+              <w:spacing w:after="0"/>
+              <w:jc w:val="center"/>
+            </w:pPr>
+            <w:r>
+              <w:rPr>
+                <w:rFonts w:ascii="Arial" w:eastAsia="Arial" w:hAnsi="Arial" w:cs="Arial"/>
+                <w:b/>
+                <w:bCs/>
+                <w:color w:val="000000" w:themeColor="text1"/>
+                <w:sz w:val="22"/>
+                <w:szCs w:val="22"/>
+              </w:rPr>
+              <w:t>Integrantes del grupo de trabajo:</w:t>
+            </w:r>
+          </w:p>
+          <w:p>
+            <w:pPr>
+              <w:spacing w:after="0"/>
+              <w:jc w:val="center"/>
+            </w:pPr>
+            <w:r>
+              <w:rPr>
+                <w:rFonts w:ascii="Arial" w:eastAsia="Arial" w:hAnsi="Arial" w:cs="Arial"/>
+                <w:color w:val="000000" w:themeColor="text1"/>
+                <w:sz w:val="22"/>
+                <w:szCs w:val="22"/>
+              </w:rPr>
+              <w:t xml:space="preserve">Eric Castro Velázquez </w:t>
+            </w:r>
+          </w:p>
+          <w:p>
+            <w:pPr>
+              <w:spacing w:after="0"/>
+              <w:jc w:val="center"/>
+              <w:rPr>
+                <w:rFonts w:ascii="Arial" w:eastAsia="Arial" w:hAnsi="Arial" w:cs="Arial"/>
+                <w:color w:val="000000" w:themeColor="text1"/>
+                <w:sz w:val="22"/>
+                <w:szCs w:val="22"/>
+              </w:rPr>
+            </w:pPr>
+            <w:r>
+              <w:rPr>
+                <w:rFonts w:ascii="Arial" w:eastAsia="Arial" w:hAnsi="Arial" w:cs="Arial"/>
+                <w:color w:val="000000" w:themeColor="text1"/>
+                <w:sz w:val="22"/>
+                <w:szCs w:val="22"/>
+              </w:rPr>
+              <w:t>Daniel Chavarría García</w:t>
+            </w:r>
+          </w:p>
+          <w:p>
+            <w:pPr>
+              <w:spacing w:after="0"/>
+              <w:jc w:val="center"/>
+              <w:rPr>
+                <w:rFonts w:ascii="Arial" w:eastAsia="Arial" w:hAnsi="Arial" w:cs="Arial"/>
+                <w:color w:val="000000" w:themeColor="text1"/>
+                <w:sz w:val="22"/>
+                <w:szCs w:val="22"/>
+              </w:rPr>
+            </w:pPr>
+            <w:r>
+              <w:rPr>
+                <w:rFonts w:ascii="Arial" w:eastAsia="Arial" w:hAnsi="Arial" w:cs="Arial"/>
+                <w:color w:val="000000" w:themeColor="text1"/>
+                <w:sz w:val="22"/>
+                <w:szCs w:val="22"/>
+              </w:rPr>
+              <w:t>Esteban Segura García</w:t>
+            </w:r>
+          </w:p>
+          <w:p>
+            <w:pPr>
+              <w:spacing w:after="0"/>
+              <w:jc w:val="center"/>
+              <w:rPr>
+                <w:rFonts w:ascii="Arial" w:eastAsia="Arial" w:hAnsi="Arial" w:cs="Arial"/>
+                <w:color w:val="000000" w:themeColor="text1"/>
+                <w:sz w:val="22"/>
+                <w:szCs w:val="22"/>
+              </w:rPr>
+            </w:pPr>
+          </w:p>
+          <w:p>
+            <w:pPr>
+              <w:spacing w:after="0"/>
+              <w:jc w:val="center"/>
+              <w:rPr>
+                <w:rFonts w:ascii="Arial" w:eastAsia="Arial" w:hAnsi="Arial" w:cs="Arial"/>
+                <w:color w:val="000000" w:themeColor="text1"/>
+                <w:sz w:val="22"/>
+                <w:szCs w:val="22"/>
+              </w:rPr>
+            </w:pPr>
+          </w:p>
+        </w:tc>
+        <w:tc>
+          <w:tcPr>
+            <w:tcW w:w="4649" w:type="dxa"/>
+            <w:tcBorders>
+              <w:top w:val="single" w:sz="8" w:space="0" w:color="000000" w:themeColor="text1"/>
+              <w:left w:val="single" w:sz="8" w:space="0" w:color="000000" w:themeColor="text1"/>
+              <w:bottom w:val="single" w:sz="8" w:space="0" w:color="000000" w:themeColor="text1"/>
+              <w:right w:val="single" w:sz="8" w:space="0" w:color="000000" w:themeColor="text1"/>
+            </w:tcBorders>
+            <w:tcMar>
+              <w:top w:w="100" w:type="dxa"/>
+              <w:left w:w="100" w:type="dxa"/>
+              <w:bottom w:w="100" w:type="dxa"/>
+              <w:right w:w="100" w:type="dxa"/>
+            </w:tcMar>
+          </w:tcPr>
+          <w:p>
+            <w:pPr>
+              <w:spacing w:after="0"/>
+              <w:jc w:val="center"/>
+            </w:pPr>
+            <w:r>
+              <w:rPr>
+                <w:rFonts w:ascii="Arial" w:eastAsia="Arial" w:hAnsi="Arial" w:cs="Arial"/>
+                <w:color w:val="000000" w:themeColor="text1"/>
+                <w:sz w:val="22"/>
+                <w:szCs w:val="22"/>
+              </w:rPr>
+              <w:t xml:space="preserve"> </w:t>
+            </w:r>
+          </w:p>
+          <w:p>
+            <w:pPr>
+              <w:spacing w:after="0"/>
+              <w:jc w:val="center"/>
+            </w:pPr>
+            <w:r>
+              <w:rPr>
+                <w:rFonts w:ascii="Arial" w:eastAsia="Arial" w:hAnsi="Arial" w:cs="Arial"/>
+                <w:color w:val="000000" w:themeColor="text1"/>
+                <w:sz w:val="22"/>
+                <w:szCs w:val="22"/>
+              </w:rPr>
+              <w:t xml:space="preserve"> </w:t>
+            </w:r>
+          </w:p>
+          <w:p>
+            <w:pPr>
+              <w:spacing w:after="0"/>
+            </w:pPr>
+          </w:p>
+          <w:p>
+            <w:pPr>
+              <w:spacing w:after="0"/>
+              <w:jc w:val="center"/>
+            </w:pPr>
+            <w:r>
+              <w:rPr>
+                <w:rFonts w:ascii="Arial" w:eastAsia="Arial" w:hAnsi="Arial" w:cs="Arial"/>
+                <w:color w:val="000000" w:themeColor="text1"/>
+                <w:sz w:val="22"/>
+                <w:szCs w:val="22"/>
+              </w:rPr>
+              <w:t>Aníbal Ruiz Barquero</w:t>
+            </w:r>
+          </w:p>
+          <w:p>
+            <w:pPr>
+              <w:spacing w:after="0"/>
+            </w:pPr>
+          </w:p>
+          <w:p>
+            <w:pPr>
+              <w:spacing w:after="0"/>
+              <w:jc w:val="center"/>
+            </w:pPr>
+            <w:r>
+              <w:rPr>
+                <w:rFonts w:ascii="Arial" w:eastAsia="Arial" w:hAnsi="Arial" w:cs="Arial"/>
+                <w:color w:val="000000" w:themeColor="text1"/>
+                <w:sz w:val="22"/>
+                <w:szCs w:val="22"/>
+              </w:rPr>
+              <w:t xml:space="preserve">  </w:t>
+            </w:r>
+          </w:p>
+        </w:tc>
+      </w:tr>
+      <w:tr>
+        <w:trPr>
+          <w:trHeight w:val="480"/>
+        </w:trPr>
+        <w:tc>
+          <w:tcPr>
+            <w:tcW w:w="4559" w:type="dxa"/>
+            <w:tcBorders>
+              <w:top w:val="single" w:sz="8" w:space="0" w:color="000000" w:themeColor="text1"/>
+              <w:left w:val="single" w:sz="8" w:space="0" w:color="000000" w:themeColor="text1"/>
+              <w:bottom w:val="single" w:sz="8" w:space="0" w:color="000000" w:themeColor="text1"/>
+              <w:right w:val="single" w:sz="8" w:space="0" w:color="000000" w:themeColor="text1"/>
+            </w:tcBorders>
+            <w:tcMar>
+              <w:top w:w="100" w:type="dxa"/>
+              <w:left w:w="100" w:type="dxa"/>
+              <w:bottom w:w="100" w:type="dxa"/>
+              <w:right w:w="100" w:type="dxa"/>
+            </w:tcMar>
+          </w:tcPr>
+          <w:p>
+            <w:pPr>
+              <w:spacing w:after="0"/>
+              <w:jc w:val="center"/>
+            </w:pPr>
+            <w:r>
+              <w:rPr>
+                <w:rFonts w:ascii="Arial" w:eastAsia="Arial" w:hAnsi="Arial" w:cs="Arial"/>
+                <w:b/>
+                <w:bCs/>
+                <w:color w:val="000000" w:themeColor="text1"/>
+                <w:sz w:val="22"/>
+                <w:szCs w:val="22"/>
+              </w:rPr>
+              <w:t>Fechas de trabajo:</w:t>
+            </w:r>
+          </w:p>
+        </w:tc>
+        <w:tc>
+          <w:tcPr>
+            <w:tcW w:w="4649" w:type="dxa"/>
+            <w:tcBorders>
+              <w:top w:val="single" w:sz="8" w:space="0" w:color="000000" w:themeColor="text1"/>
+              <w:left w:val="single" w:sz="8" w:space="0" w:color="000000" w:themeColor="text1"/>
+              <w:bottom w:val="single" w:sz="8" w:space="0" w:color="000000" w:themeColor="text1"/>
+              <w:right w:val="single" w:sz="8" w:space="0" w:color="000000" w:themeColor="text1"/>
+            </w:tcBorders>
+            <w:tcMar>
+              <w:top w:w="100" w:type="dxa"/>
+              <w:left w:w="100" w:type="dxa"/>
+              <w:bottom w:w="100" w:type="dxa"/>
+              <w:right w:w="100" w:type="dxa"/>
+            </w:tcMar>
+          </w:tcPr>
+          <w:p>
+            <w:pPr>
+              <w:spacing w:after="0"/>
+              <w:jc w:val="center"/>
+            </w:pPr>
+            <w:r>
+              <w:rPr>
+                <w:rFonts w:ascii="Arial" w:eastAsia="Arial" w:hAnsi="Arial" w:cs="Arial"/>
+                <w:color w:val="000000" w:themeColor="text1"/>
+                <w:sz w:val="22"/>
+                <w:szCs w:val="22"/>
+              </w:rPr>
+              <w:t>4 de septiembre del 2025</w:t>
+            </w:r>
+          </w:p>
+        </w:tc>
+      </w:tr>
+      <w:tr>
+        <w:trPr>
+          <w:trHeight w:val="480"/>
+        </w:trPr>
+        <w:tc>
+          <w:tcPr>
+            <w:tcW w:w="9208" w:type="dxa"/>
+            <w:gridSpan w:val="2"/>
+            <w:tcBorders>
+              <w:top w:val="single" w:sz="8" w:space="0" w:color="000000" w:themeColor="text1"/>
+              <w:left w:val="single" w:sz="8" w:space="0" w:color="000000" w:themeColor="text1"/>
+              <w:bottom w:val="single" w:sz="8" w:space="0" w:color="000000" w:themeColor="text1"/>
+              <w:right w:val="single" w:sz="8" w:space="0" w:color="000000" w:themeColor="text1"/>
+            </w:tcBorders>
+            <w:tcMar>
+              <w:top w:w="100" w:type="dxa"/>
+              <w:left w:w="100" w:type="dxa"/>
+              <w:bottom w:w="100" w:type="dxa"/>
+              <w:right w:w="100" w:type="dxa"/>
+            </w:tcMar>
+          </w:tcPr>
+          <w:p>
+            <w:pPr>
+              <w:spacing w:after="0"/>
+            </w:pPr>
+          </w:p>
+          <w:p>
+            <w:pPr>
+              <w:spacing w:after="0"/>
+              <w:jc w:val="center"/>
+              <w:rPr>
+                <w:rFonts w:ascii="Arial" w:eastAsia="Arial" w:hAnsi="Arial" w:cs="Arial"/>
+                <w:b/>
+                <w:bCs/>
+                <w:color w:val="000000" w:themeColor="text1"/>
+                <w:sz w:val="22"/>
+                <w:szCs w:val="22"/>
+              </w:rPr>
+            </w:pPr>
+            <w:r>
+              <w:rPr>
+                <w:rFonts w:ascii="Arial" w:eastAsia="Arial" w:hAnsi="Arial" w:cs="Arial"/>
+                <w:b/>
+                <w:bCs/>
+                <w:color w:val="000000" w:themeColor="text1"/>
+                <w:sz w:val="22"/>
+                <w:szCs w:val="22"/>
+              </w:rPr>
+              <w:t xml:space="preserve">Laboratorio #: </w:t>
+            </w:r>
+            <w:proofErr w:type="gramStart"/>
+            <w:r>
+              <w:rPr>
+                <w:rFonts w:ascii="Arial" w:eastAsia="Arial" w:hAnsi="Arial" w:cs="Arial"/>
+                <w:b/>
+                <w:bCs/>
+                <w:color w:val="000000" w:themeColor="text1"/>
+                <w:sz w:val="22"/>
+                <w:szCs w:val="22"/>
+              </w:rPr>
+              <w:t xml:space="preserve">( </w:t>
+            </w:r>
+            <w:r>
+              <w:rPr>
+                <w:rFonts w:ascii="Arial" w:eastAsia="Arial" w:hAnsi="Arial" w:cs="Arial"/>
+                <w:b/>
+                <w:bCs/>
+                <w:color w:val="000000" w:themeColor="text1"/>
+                <w:sz w:val="22"/>
+                <w:szCs w:val="22"/>
+              </w:rPr>
+              <w:t>PAMH</w:t>
+            </w:r>
+            <w:proofErr w:type="gramEnd"/>
+            <w:r>
+              <w:rPr>
+                <w:rFonts w:ascii="Arial" w:eastAsia="Arial" w:hAnsi="Arial" w:cs="Arial"/>
+                <w:b/>
+                <w:bCs/>
+                <w:color w:val="000000" w:themeColor="text1"/>
+                <w:sz w:val="22"/>
+                <w:szCs w:val="22"/>
+              </w:rPr>
+              <w:t>)</w:t>
+            </w:r>
+          </w:p>
+        </w:tc>
+      </w:tr>
+      <w:tr>
+        <w:trPr>
+          <w:trHeight w:val="480"/>
+        </w:trPr>
+        <w:tc>
+          <w:tcPr>
+            <w:tcW w:w="9208" w:type="dxa"/>
+            <w:gridSpan w:val="2"/>
+            <w:tcBorders>
+              <w:top w:val="single" w:sz="8" w:space="0" w:color="000000" w:themeColor="text1"/>
+              <w:left w:val="single" w:sz="8" w:space="0" w:color="000000" w:themeColor="text1"/>
+              <w:bottom w:val="single" w:sz="8" w:space="0" w:color="000000" w:themeColor="text1"/>
+              <w:right w:val="single" w:sz="8" w:space="0" w:color="000000" w:themeColor="text1"/>
+            </w:tcBorders>
+            <w:tcMar>
+              <w:top w:w="100" w:type="dxa"/>
+              <w:left w:w="100" w:type="dxa"/>
+              <w:bottom w:w="100" w:type="dxa"/>
+              <w:right w:w="100" w:type="dxa"/>
+            </w:tcMar>
+          </w:tcPr>
+          <w:p>
+            <w:pPr>
+              <w:spacing w:after="0"/>
+              <w:jc w:val="center"/>
+              <w:rPr>
+                <w:rFonts w:ascii="Arial" w:eastAsia="Arial" w:hAnsi="Arial" w:cs="Arial"/>
+                <w:b/>
+                <w:bCs/>
+                <w:color w:val="000000" w:themeColor="text1"/>
+              </w:rPr>
+            </w:pPr>
+            <w:r>
+              <w:rPr>
+                <w:rFonts w:ascii="Arial" w:eastAsia="Arial" w:hAnsi="Arial" w:cs="Arial"/>
+                <w:b/>
+                <w:bCs/>
+                <w:color w:val="000000" w:themeColor="text1"/>
+              </w:rPr>
+              <w:t>Reporte de actividades</w:t>
+            </w:r>
+          </w:p>
+          <w:p>
+            <w:pPr>
+              <w:spacing w:after="0"/>
+            </w:pPr>
+            <w:r>
+              <w:rPr>
+                <w:rFonts w:ascii="Arial" w:eastAsia="Arial" w:hAnsi="Arial" w:cs="Arial"/>
+                <w:b/>
+                <w:bCs/>
+                <w:color w:val="000000" w:themeColor="text1"/>
+              </w:rPr>
+              <w:t xml:space="preserve">Actividad:  </w:t>
+            </w:r>
+            <w:r>
+              <w:t>Recolección de datos y modelado del sistema</w:t>
+            </w:r>
+          </w:p>
+          <w:p>
+            <w:pPr>
+              <w:spacing w:after="0"/>
+            </w:pPr>
+            <w:r>
+              <w:t xml:space="preserve">Se realiza el 25 de Marzo la recolección de datos de la planta y se empieza a trabajar para modelar la función de transferencia utilizando el System Identification, obteniendo un X% de similitud con respecto al modelo obtenido. </w:t>
+            </w:r>
+          </w:p>
+        </w:tc>
+      </w:tr>
+    </w:tbl>
+    <w:p/>
+    <w:p>
+      <w:r>
+        <w:br w:type="page"/>
+      </w:r>
+    </w:p>
+    <w:tbl>
+      <w:tblPr>
+        <w:tblW w:w="0" w:type="auto"/>
+        <w:tblLayout w:type="fixed"/>
+        <w:tblLook w:val="06A0" w:firstRow="1" w:lastRow="0" w:firstColumn="1" w:lastColumn="0" w:noHBand="1" w:noVBand="1"/>
+      </w:tblPr>
+      <w:tblGrid>
+        <w:gridCol w:w="4559"/>
+        <w:gridCol w:w="4649"/>
+      </w:tblGrid>
+      <w:tr>
+        <w:trPr>
+          <w:trHeight w:val="975"/>
+        </w:trPr>
+        <w:tc>
+          <w:tcPr>
+            <w:tcW w:w="4559" w:type="dxa"/>
+            <w:tcBorders>
+              <w:top w:val="single" w:sz="8" w:space="0" w:color="000000" w:themeColor="text1"/>
+              <w:left w:val="single" w:sz="8" w:space="0" w:color="000000" w:themeColor="text1"/>
+              <w:bottom w:val="single" w:sz="8" w:space="0" w:color="000000" w:themeColor="text1"/>
+              <w:right w:val="single" w:sz="8" w:space="0" w:color="000000" w:themeColor="text1"/>
+            </w:tcBorders>
+            <w:tcMar>
+              <w:top w:w="100" w:type="dxa"/>
+              <w:left w:w="100" w:type="dxa"/>
+              <w:bottom w:w="100" w:type="dxa"/>
+              <w:right w:w="100" w:type="dxa"/>
+            </w:tcMar>
+          </w:tcPr>
+          <w:p>
+            <w:pPr>
+              <w:spacing w:after="0"/>
+              <w:jc w:val="center"/>
+            </w:pPr>
+            <w:r>
+              <w:rPr>
+                <w:rFonts w:ascii="Arial" w:eastAsia="Arial" w:hAnsi="Arial" w:cs="Arial"/>
+                <w:b/>
+                <w:bCs/>
+                <w:color w:val="000000" w:themeColor="text1"/>
+                <w:sz w:val="22"/>
+                <w:szCs w:val="22"/>
+              </w:rPr>
+              <w:lastRenderedPageBreak/>
+              <w:t>Tecnológico de Costa Rica</w:t>
+            </w:r>
+          </w:p>
+          <w:p>
+            <w:pPr>
+              <w:spacing w:after="0"/>
+              <w:jc w:val="center"/>
+              <w:rPr>
+                <w:rFonts w:ascii="Arial" w:eastAsia="Arial" w:hAnsi="Arial" w:cs="Arial"/>
+                <w:b/>
+                <w:bCs/>
+                <w:color w:val="000000" w:themeColor="text1"/>
+                <w:sz w:val="22"/>
+                <w:szCs w:val="22"/>
+              </w:rPr>
+            </w:pPr>
+            <w:r>
+              <w:rPr>
+                <w:rFonts w:ascii="Arial" w:eastAsia="Arial" w:hAnsi="Arial" w:cs="Arial"/>
+                <w:b/>
+                <w:bCs/>
+                <w:color w:val="000000" w:themeColor="text1"/>
+                <w:sz w:val="22"/>
+                <w:szCs w:val="22"/>
+              </w:rPr>
+              <w:t>Laboratorio de Control Automático</w:t>
+            </w:r>
+          </w:p>
+        </w:tc>
+        <w:tc>
+          <w:tcPr>
+            <w:tcW w:w="4649" w:type="dxa"/>
+            <w:tcBorders>
+              <w:top w:val="single" w:sz="8" w:space="0" w:color="000000" w:themeColor="text1"/>
+              <w:left w:val="single" w:sz="8" w:space="0" w:color="000000" w:themeColor="text1"/>
+              <w:bottom w:val="single" w:sz="8" w:space="0" w:color="000000" w:themeColor="text1"/>
+              <w:right w:val="single" w:sz="8" w:space="0" w:color="000000" w:themeColor="text1"/>
+            </w:tcBorders>
+            <w:tcMar>
+              <w:top w:w="100" w:type="dxa"/>
+              <w:left w:w="100" w:type="dxa"/>
+              <w:bottom w:w="100" w:type="dxa"/>
+              <w:right w:w="100" w:type="dxa"/>
+            </w:tcMar>
+          </w:tcPr>
+          <w:p>
+            <w:pPr>
+              <w:spacing w:after="0"/>
+              <w:jc w:val="center"/>
+            </w:pPr>
+            <w:r>
+              <w:rPr>
+                <w:noProof/>
+              </w:rPr>
+              <w:drawing>
+                <wp:inline distT="0" distB="0" distL="0" distR="0" wp14:anchorId="3714735F" wp14:editId="269ACC58">
+                  <wp:extent cx="2276475" cy="361950"/>
+                  <wp:effectExtent l="0" t="0" r="0" b="0"/>
+                  <wp:docPr id="1518857032" name="drawing"/>
+                  <wp:cNvGraphicFramePr>
+                    <a:graphicFrameLocks xmlns:a="http://schemas.openxmlformats.org/drawingml/2006/main" noChangeAspect="1"/>
+                  </wp:cNvGraphicFramePr>
+                  <a:graphic xmlns:a="http://schemas.openxmlformats.org/drawingml/2006/main">
+                    <a:graphicData uri="http://schemas.openxmlformats.org/drawingml/2006/picture">
+                      <pic:pic xmlns:pic="http://schemas.openxmlformats.org/drawingml/2006/picture">
+                        <pic:nvPicPr>
+                          <pic:cNvPr id="1288723972" name=""/>
+                          <pic:cNvPicPr/>
+                        </pic:nvPicPr>
+                        <pic:blipFill>
+                          <a:blip r:embed="rId4">
+                            <a:extLst>
+                              <a:ext uri="{28A0092B-C50C-407E-A947-70E740481C1C}">
+                                <a14:useLocalDpi xmlns:a14="http://schemas.microsoft.com/office/drawing/2010/main" val="0"/>
+                              </a:ext>
+                            </a:extLst>
+                          </a:blip>
+                          <a:stretch>
+                            <a:fillRect/>
+                          </a:stretch>
+                        </pic:blipFill>
+                        <pic:spPr>
+                          <a:xfrm>
+                            <a:off x="0" y="0"/>
+                            <a:ext cx="2276475" cy="361950"/>
+                          </a:xfrm>
+                          <a:prstGeom prst="rect">
+                            <a:avLst/>
+                          </a:prstGeom>
+                        </pic:spPr>
+                      </pic:pic>
+                    </a:graphicData>
+                  </a:graphic>
+                </wp:inline>
+              </w:drawing>
+            </w:r>
+          </w:p>
+        </w:tc>
+      </w:tr>
+      <w:tr>
+        <w:trPr>
+          <w:trHeight w:val="540"/>
+        </w:trPr>
+        <w:tc>
+          <w:tcPr>
+            <w:tcW w:w="9208" w:type="dxa"/>
+            <w:gridSpan w:val="2"/>
+            <w:tcBorders>
+              <w:top w:val="single" w:sz="8" w:space="0" w:color="000000" w:themeColor="text1"/>
+              <w:left w:val="single" w:sz="8" w:space="0" w:color="000000" w:themeColor="text1"/>
+              <w:bottom w:val="single" w:sz="8" w:space="0" w:color="000000" w:themeColor="text1"/>
+              <w:right w:val="single" w:sz="8" w:space="0" w:color="000000" w:themeColor="text1"/>
+            </w:tcBorders>
+            <w:tcMar>
+              <w:top w:w="100" w:type="dxa"/>
+              <w:left w:w="100" w:type="dxa"/>
+              <w:bottom w:w="100" w:type="dxa"/>
+              <w:right w:w="100" w:type="dxa"/>
+            </w:tcMar>
+          </w:tcPr>
+          <w:p>
+            <w:pPr>
+              <w:spacing w:after="0"/>
+              <w:jc w:val="center"/>
+            </w:pPr>
+            <w:r>
+              <w:rPr>
+                <w:rFonts w:ascii="Arial" w:eastAsia="Arial" w:hAnsi="Arial" w:cs="Arial"/>
+                <w:b/>
+                <w:bCs/>
+                <w:color w:val="000000" w:themeColor="text1"/>
+                <w:sz w:val="22"/>
+                <w:szCs w:val="22"/>
+              </w:rPr>
+              <w:t xml:space="preserve">Cuaderno de Ingeniería - Grupo </w:t>
+            </w:r>
+            <w:r>
+              <w:rPr>
+                <w:rFonts w:ascii="Arial" w:eastAsia="Arial" w:hAnsi="Arial" w:cs="Arial"/>
+                <w:b/>
+                <w:bCs/>
+                <w:color w:val="000000" w:themeColor="text1"/>
+                <w:sz w:val="22"/>
+                <w:szCs w:val="22"/>
+              </w:rPr>
+              <w:t>B</w:t>
+            </w:r>
+          </w:p>
+        </w:tc>
+      </w:tr>
+      <w:tr>
+        <w:trPr>
+          <w:trHeight w:val="2280"/>
+        </w:trPr>
+        <w:tc>
+          <w:tcPr>
+            <w:tcW w:w="4559" w:type="dxa"/>
+            <w:tcBorders>
+              <w:top w:val="single" w:sz="8" w:space="0" w:color="000000" w:themeColor="text1"/>
+              <w:left w:val="single" w:sz="8" w:space="0" w:color="000000" w:themeColor="text1"/>
+              <w:bottom w:val="single" w:sz="8" w:space="0" w:color="000000" w:themeColor="text1"/>
+              <w:right w:val="single" w:sz="8" w:space="0" w:color="000000" w:themeColor="text1"/>
+            </w:tcBorders>
+            <w:tcMar>
+              <w:top w:w="100" w:type="dxa"/>
+              <w:left w:w="100" w:type="dxa"/>
+              <w:bottom w:w="100" w:type="dxa"/>
+              <w:right w:w="100" w:type="dxa"/>
+            </w:tcMar>
+          </w:tcPr>
+          <w:p>
+            <w:pPr>
+              <w:spacing w:after="0"/>
+              <w:jc w:val="center"/>
+            </w:pPr>
+            <w:r>
+              <w:rPr>
+                <w:rFonts w:ascii="Arial" w:eastAsia="Arial" w:hAnsi="Arial" w:cs="Arial"/>
+                <w:b/>
+                <w:bCs/>
+                <w:color w:val="000000" w:themeColor="text1"/>
+                <w:sz w:val="22"/>
+                <w:szCs w:val="22"/>
+              </w:rPr>
+              <w:t>Integrantes del grupo de trabajo:</w:t>
+            </w:r>
+          </w:p>
+          <w:p>
+            <w:pPr>
+              <w:spacing w:after="0"/>
+              <w:jc w:val="center"/>
+            </w:pPr>
+            <w:r>
+              <w:rPr>
+                <w:rFonts w:ascii="Arial" w:eastAsia="Arial" w:hAnsi="Arial" w:cs="Arial"/>
+                <w:color w:val="000000" w:themeColor="text1"/>
+                <w:sz w:val="22"/>
+                <w:szCs w:val="22"/>
+              </w:rPr>
+              <w:t xml:space="preserve">Eric Castro Velázquez </w:t>
+            </w:r>
+          </w:p>
+          <w:p>
+            <w:pPr>
+              <w:spacing w:after="0"/>
+              <w:jc w:val="center"/>
+              <w:rPr>
+                <w:rFonts w:ascii="Arial" w:eastAsia="Arial" w:hAnsi="Arial" w:cs="Arial"/>
+                <w:color w:val="000000" w:themeColor="text1"/>
+                <w:sz w:val="22"/>
+                <w:szCs w:val="22"/>
+              </w:rPr>
+            </w:pPr>
+            <w:r>
+              <w:rPr>
+                <w:rFonts w:ascii="Arial" w:eastAsia="Arial" w:hAnsi="Arial" w:cs="Arial"/>
+                <w:color w:val="000000" w:themeColor="text1"/>
+                <w:sz w:val="22"/>
+                <w:szCs w:val="22"/>
+              </w:rPr>
+              <w:t>Daniel Chavarría García</w:t>
+            </w:r>
+          </w:p>
+          <w:p>
+            <w:pPr>
+              <w:spacing w:after="0"/>
+              <w:jc w:val="center"/>
+              <w:rPr>
+                <w:rFonts w:ascii="Arial" w:eastAsia="Arial" w:hAnsi="Arial" w:cs="Arial"/>
+                <w:color w:val="000000" w:themeColor="text1"/>
+                <w:sz w:val="22"/>
+                <w:szCs w:val="22"/>
+              </w:rPr>
+            </w:pPr>
+            <w:r>
+              <w:rPr>
+                <w:rFonts w:ascii="Arial" w:eastAsia="Arial" w:hAnsi="Arial" w:cs="Arial"/>
+                <w:color w:val="000000" w:themeColor="text1"/>
+                <w:sz w:val="22"/>
+                <w:szCs w:val="22"/>
+              </w:rPr>
+              <w:t>Esteban Segura García</w:t>
+            </w:r>
+          </w:p>
+          <w:p>
+            <w:pPr>
+              <w:spacing w:after="0"/>
+              <w:jc w:val="center"/>
+              <w:rPr>
+                <w:rFonts w:ascii="Arial" w:eastAsia="Arial" w:hAnsi="Arial" w:cs="Arial"/>
+                <w:color w:val="000000" w:themeColor="text1"/>
+                <w:sz w:val="22"/>
+                <w:szCs w:val="22"/>
+              </w:rPr>
+            </w:pPr>
+          </w:p>
+          <w:p>
+            <w:pPr>
+              <w:spacing w:after="0"/>
+              <w:jc w:val="center"/>
+              <w:rPr>
+                <w:rFonts w:ascii="Arial" w:eastAsia="Arial" w:hAnsi="Arial" w:cs="Arial"/>
+                <w:color w:val="000000" w:themeColor="text1"/>
+                <w:sz w:val="22"/>
+                <w:szCs w:val="22"/>
+              </w:rPr>
+            </w:pPr>
+          </w:p>
+        </w:tc>
+        <w:tc>
+          <w:tcPr>
+            <w:tcW w:w="4649" w:type="dxa"/>
+            <w:tcBorders>
+              <w:top w:val="single" w:sz="8" w:space="0" w:color="000000" w:themeColor="text1"/>
+              <w:left w:val="single" w:sz="8" w:space="0" w:color="000000" w:themeColor="text1"/>
+              <w:bottom w:val="single" w:sz="8" w:space="0" w:color="000000" w:themeColor="text1"/>
+              <w:right w:val="single" w:sz="8" w:space="0" w:color="000000" w:themeColor="text1"/>
+            </w:tcBorders>
+            <w:tcMar>
+              <w:top w:w="100" w:type="dxa"/>
+              <w:left w:w="100" w:type="dxa"/>
+              <w:bottom w:w="100" w:type="dxa"/>
+              <w:right w:w="100" w:type="dxa"/>
+            </w:tcMar>
+          </w:tcPr>
+          <w:p>
+            <w:pPr>
+              <w:spacing w:after="0"/>
+              <w:jc w:val="center"/>
+            </w:pPr>
+            <w:r>
+              <w:rPr>
+                <w:rFonts w:ascii="Arial" w:eastAsia="Arial" w:hAnsi="Arial" w:cs="Arial"/>
+                <w:color w:val="000000" w:themeColor="text1"/>
+                <w:sz w:val="22"/>
+                <w:szCs w:val="22"/>
+              </w:rPr>
+              <w:t xml:space="preserve"> </w:t>
+            </w:r>
+          </w:p>
+          <w:p>
+            <w:pPr>
+              <w:spacing w:after="0"/>
+              <w:jc w:val="center"/>
+            </w:pPr>
+            <w:r>
+              <w:rPr>
+                <w:rFonts w:ascii="Arial" w:eastAsia="Arial" w:hAnsi="Arial" w:cs="Arial"/>
+                <w:color w:val="000000" w:themeColor="text1"/>
+                <w:sz w:val="22"/>
+                <w:szCs w:val="22"/>
+              </w:rPr>
+              <w:t xml:space="preserve"> </w:t>
+            </w:r>
+          </w:p>
+          <w:p>
+            <w:pPr>
+              <w:spacing w:after="0"/>
+            </w:pPr>
+          </w:p>
+          <w:p>
+            <w:pPr>
+              <w:spacing w:after="0"/>
+              <w:jc w:val="center"/>
+            </w:pPr>
+            <w:r>
+              <w:rPr>
+                <w:rFonts w:ascii="Arial" w:eastAsia="Arial" w:hAnsi="Arial" w:cs="Arial"/>
+                <w:color w:val="000000" w:themeColor="text1"/>
+                <w:sz w:val="22"/>
+                <w:szCs w:val="22"/>
+              </w:rPr>
+              <w:t>Aníbal Ruiz Barquero</w:t>
+            </w:r>
+          </w:p>
+          <w:p>
+            <w:pPr>
+              <w:spacing w:after="0"/>
+            </w:pPr>
+          </w:p>
+          <w:p>
+            <w:pPr>
+              <w:spacing w:after="0"/>
+              <w:jc w:val="center"/>
+            </w:pPr>
+            <w:r>
+              <w:rPr>
+                <w:rFonts w:ascii="Arial" w:eastAsia="Arial" w:hAnsi="Arial" w:cs="Arial"/>
+                <w:color w:val="000000" w:themeColor="text1"/>
+                <w:sz w:val="22"/>
+                <w:szCs w:val="22"/>
+              </w:rPr>
+              <w:t xml:space="preserve">  </w:t>
+            </w:r>
+          </w:p>
+        </w:tc>
+      </w:tr>
+      <w:tr>
+        <w:trPr>
+          <w:trHeight w:val="480"/>
+        </w:trPr>
+        <w:tc>
+          <w:tcPr>
+            <w:tcW w:w="4559" w:type="dxa"/>
+            <w:tcBorders>
+              <w:top w:val="single" w:sz="8" w:space="0" w:color="000000" w:themeColor="text1"/>
+              <w:left w:val="single" w:sz="8" w:space="0" w:color="000000" w:themeColor="text1"/>
+              <w:bottom w:val="single" w:sz="8" w:space="0" w:color="000000" w:themeColor="text1"/>
+              <w:right w:val="single" w:sz="8" w:space="0" w:color="000000" w:themeColor="text1"/>
+            </w:tcBorders>
+            <w:tcMar>
+              <w:top w:w="100" w:type="dxa"/>
+              <w:left w:w="100" w:type="dxa"/>
+              <w:bottom w:w="100" w:type="dxa"/>
+              <w:right w:w="100" w:type="dxa"/>
+            </w:tcMar>
+          </w:tcPr>
+          <w:p>
+            <w:pPr>
+              <w:spacing w:after="0"/>
+              <w:jc w:val="center"/>
+            </w:pPr>
+            <w:r>
+              <w:rPr>
+                <w:rFonts w:ascii="Arial" w:eastAsia="Arial" w:hAnsi="Arial" w:cs="Arial"/>
+                <w:b/>
+                <w:bCs/>
+                <w:color w:val="000000" w:themeColor="text1"/>
+                <w:sz w:val="22"/>
+                <w:szCs w:val="22"/>
+              </w:rPr>
+              <w:t>Fechas de trabajo:</w:t>
+            </w:r>
+          </w:p>
+        </w:tc>
+        <w:tc>
+          <w:tcPr>
+            <w:tcW w:w="4649" w:type="dxa"/>
+            <w:tcBorders>
+              <w:top w:val="single" w:sz="8" w:space="0" w:color="000000" w:themeColor="text1"/>
+              <w:left w:val="single" w:sz="8" w:space="0" w:color="000000" w:themeColor="text1"/>
+              <w:bottom w:val="single" w:sz="8" w:space="0" w:color="000000" w:themeColor="text1"/>
+              <w:right w:val="single" w:sz="8" w:space="0" w:color="000000" w:themeColor="text1"/>
+            </w:tcBorders>
+            <w:tcMar>
+              <w:top w:w="100" w:type="dxa"/>
+              <w:left w:w="100" w:type="dxa"/>
+              <w:bottom w:w="100" w:type="dxa"/>
+              <w:right w:w="100" w:type="dxa"/>
+            </w:tcMar>
+          </w:tcPr>
+          <w:p>
+            <w:pPr>
+              <w:spacing w:after="0"/>
+              <w:jc w:val="center"/>
+            </w:pPr>
+            <w:r>
+              <w:rPr>
+                <w:rFonts w:ascii="Arial" w:eastAsia="Arial" w:hAnsi="Arial" w:cs="Arial"/>
+                <w:color w:val="000000" w:themeColor="text1"/>
+                <w:sz w:val="22"/>
+                <w:szCs w:val="22"/>
+              </w:rPr>
+              <w:t>4 de septiembre del 2025</w:t>
+            </w:r>
+          </w:p>
+        </w:tc>
+      </w:tr>
+      <w:tr>
+        <w:trPr>
+          <w:trHeight w:val="480"/>
+        </w:trPr>
+        <w:tc>
+          <w:tcPr>
+            <w:tcW w:w="9208" w:type="dxa"/>
+            <w:gridSpan w:val="2"/>
+            <w:tcBorders>
+              <w:top w:val="single" w:sz="8" w:space="0" w:color="000000" w:themeColor="text1"/>
+              <w:left w:val="single" w:sz="8" w:space="0" w:color="000000" w:themeColor="text1"/>
+              <w:bottom w:val="single" w:sz="8" w:space="0" w:color="000000" w:themeColor="text1"/>
+              <w:right w:val="single" w:sz="8" w:space="0" w:color="000000" w:themeColor="text1"/>
+            </w:tcBorders>
+            <w:tcMar>
+              <w:top w:w="100" w:type="dxa"/>
+              <w:left w:w="100" w:type="dxa"/>
+              <w:bottom w:w="100" w:type="dxa"/>
+              <w:right w:w="100" w:type="dxa"/>
+            </w:tcMar>
+          </w:tcPr>
+          <w:p>
+            <w:pPr>
+              <w:spacing w:after="0"/>
+            </w:pPr>
+          </w:p>
+          <w:p>
+            <w:pPr>
+              <w:spacing w:after="0"/>
+              <w:jc w:val="center"/>
+              <w:rPr>
+                <w:rFonts w:ascii="Arial" w:eastAsia="Arial" w:hAnsi="Arial" w:cs="Arial"/>
+                <w:b/>
+                <w:bCs/>
+                <w:color w:val="000000" w:themeColor="text1"/>
+                <w:sz w:val="22"/>
+                <w:szCs w:val="22"/>
+              </w:rPr>
+            </w:pPr>
+            <w:r>
+              <w:rPr>
+                <w:rFonts w:ascii="Arial" w:eastAsia="Arial" w:hAnsi="Arial" w:cs="Arial"/>
+                <w:b/>
+                <w:bCs/>
+                <w:color w:val="000000" w:themeColor="text1"/>
+                <w:sz w:val="22"/>
+                <w:szCs w:val="22"/>
+              </w:rPr>
+              <w:t xml:space="preserve">Laboratorio #: </w:t>
+            </w:r>
+            <w:proofErr w:type="gramStart"/>
+            <w:r>
+              <w:rPr>
+                <w:rFonts w:ascii="Arial" w:eastAsia="Arial" w:hAnsi="Arial" w:cs="Arial"/>
+                <w:b/>
+                <w:bCs/>
+                <w:color w:val="000000" w:themeColor="text1"/>
+                <w:sz w:val="22"/>
+                <w:szCs w:val="22"/>
+              </w:rPr>
+              <w:t xml:space="preserve">( </w:t>
+            </w:r>
+            <w:r>
+              <w:rPr>
+                <w:rFonts w:ascii="Arial" w:eastAsia="Arial" w:hAnsi="Arial" w:cs="Arial"/>
+                <w:b/>
+                <w:bCs/>
+                <w:color w:val="000000" w:themeColor="text1"/>
+                <w:sz w:val="22"/>
+                <w:szCs w:val="22"/>
+              </w:rPr>
+              <w:t>PAMH</w:t>
+            </w:r>
+            <w:proofErr w:type="gramEnd"/>
+            <w:r>
+              <w:rPr>
+                <w:rFonts w:ascii="Arial" w:eastAsia="Arial" w:hAnsi="Arial" w:cs="Arial"/>
+                <w:b/>
+                <w:bCs/>
+                <w:color w:val="000000" w:themeColor="text1"/>
+                <w:sz w:val="22"/>
+                <w:szCs w:val="22"/>
+              </w:rPr>
+              <w:t>)</w:t>
+            </w:r>
+          </w:p>
+        </w:tc>
+      </w:tr>
+      <w:tr>
+        <w:trPr>
+          <w:trHeight w:val="480"/>
+        </w:trPr>
+        <w:tc>
+          <w:tcPr>
+            <w:tcW w:w="9208" w:type="dxa"/>
+            <w:gridSpan w:val="2"/>
+            <w:tcBorders>
+              <w:top w:val="single" w:sz="8" w:space="0" w:color="000000" w:themeColor="text1"/>
+              <w:left w:val="single" w:sz="8" w:space="0" w:color="000000" w:themeColor="text1"/>
+              <w:bottom w:val="single" w:sz="8" w:space="0" w:color="000000" w:themeColor="text1"/>
+              <w:right w:val="single" w:sz="8" w:space="0" w:color="000000" w:themeColor="text1"/>
+            </w:tcBorders>
+            <w:tcMar>
+              <w:top w:w="100" w:type="dxa"/>
+              <w:left w:w="100" w:type="dxa"/>
+              <w:bottom w:w="100" w:type="dxa"/>
+              <w:right w:w="100" w:type="dxa"/>
+            </w:tcMar>
+          </w:tcPr>
+          <w:p>
+            <w:pPr>
+              <w:spacing w:after="0"/>
+              <w:jc w:val="center"/>
+              <w:rPr>
+                <w:rFonts w:ascii="Arial" w:eastAsia="Arial" w:hAnsi="Arial" w:cs="Arial"/>
+                <w:b/>
+                <w:bCs/>
+                <w:color w:val="000000" w:themeColor="text1"/>
+              </w:rPr>
+            </w:pPr>
+            <w:r>
+              <w:rPr>
+                <w:rFonts w:ascii="Arial" w:eastAsia="Arial" w:hAnsi="Arial" w:cs="Arial"/>
+                <w:b/>
+                <w:bCs/>
+                <w:color w:val="000000" w:themeColor="text1"/>
+              </w:rPr>
+              <w:t>Reporte de actividades</w:t>
+            </w:r>
+          </w:p>
+          <w:p>
+            <w:pPr>
+              <w:spacing w:after="0"/>
+            </w:pPr>
+            <w:r>
+              <w:rPr>
+                <w:rFonts w:ascii="Arial" w:eastAsia="Arial" w:hAnsi="Arial" w:cs="Arial"/>
+                <w:b/>
+                <w:bCs/>
+                <w:color w:val="000000" w:themeColor="text1"/>
+              </w:rPr>
+              <w:t xml:space="preserve">Actividad:  </w:t>
+            </w:r>
+            <w:r>
+              <w:rPr>
+                <w:rFonts w:ascii="Arial" w:eastAsia="Arial" w:hAnsi="Arial" w:cs="Arial"/>
+                <w:color w:val="000000" w:themeColor="text1"/>
+              </w:rPr>
+              <w:t xml:space="preserve">Diseño de controladores </w:t>
+            </w:r>
+          </w:p>
+          <w:p>
+            <w:pPr>
+              <w:spacing w:after="0"/>
+            </w:pPr>
+            <w:r>
+              <w:lastRenderedPageBreak/>
+              <w:t xml:space="preserve">Se realiza el 8 de abril </w:t>
+            </w:r>
+            <w:r>
+              <w:t>el diseño de controladores. Primeramente, el controlador REI por LQR se diseña utilizando Matlab, dando como resultado los siguientes valores:</w:t>
+            </w:r>
+            <w:r>
+              <w:br/>
+            </w:r>
+            <w:r>
+              <w:drawing>
+                <wp:inline distT="0" distB="0" distL="0" distR="0" wp14:anchorId="05929C1B" wp14:editId="647B71E0">
+                  <wp:extent cx="2962688" cy="4324954"/>
+                  <wp:effectExtent l="0" t="0" r="0" b="0"/>
+                  <wp:docPr id="169703112" name="Imagen 1"/>
+                  <wp:cNvGraphicFramePr>
+                    <a:graphicFrameLocks xmlns:a="http://schemas.openxmlformats.org/drawingml/2006/main" noChangeAspect="1"/>
+                  </wp:cNvGraphicFramePr>
+                  <a:graphic xmlns:a="http://schemas.openxmlformats.org/drawingml/2006/main">
+                    <a:graphicData uri="http://schemas.openxmlformats.org/drawingml/2006/picture">
+                      <pic:pic xmlns:pic="http://schemas.openxmlformats.org/drawingml/2006/picture">
+                        <pic:nvPicPr>
+                          <pic:cNvPr id="169703112" name=""/>
+                          <pic:cNvPicPr/>
+                        </pic:nvPicPr>
+                        <pic:blipFill>
+                          <a:blip r:embed="rId5"/>
+                          <a:stretch>
+                            <a:fillRect/>
+                          </a:stretch>
+                        </pic:blipFill>
+                        <pic:spPr>
+                          <a:xfrm>
+                            <a:off x="0" y="0"/>
+                            <a:ext cx="2962688" cy="4324954"/>
+                          </a:xfrm>
+                          <a:prstGeom prst="rect">
+                            <a:avLst/>
+                          </a:prstGeom>
+                        </pic:spPr>
+                      </pic:pic>
+                    </a:graphicData>
+                  </a:graphic>
+                </wp:inline>
+              </w:drawing>
+            </w:r>
+          </w:p>
+          <w:p>
+            <w:pPr>
+              <w:spacing w:after="0"/>
+            </w:pPr>
+            <w:r>
+              <w:lastRenderedPageBreak/>
+              <w:drawing>
+                <wp:inline distT="0" distB="0" distL="0" distR="0" wp14:anchorId="18DFB688" wp14:editId="7339D01B">
+                  <wp:extent cx="3491081" cy="4010025"/>
+                  <wp:effectExtent l="0" t="0" r="0" b="0"/>
+                  <wp:docPr id="1202432205" name="Imagen 1"/>
+                  <wp:cNvGraphicFramePr>
+                    <a:graphicFrameLocks xmlns:a="http://schemas.openxmlformats.org/drawingml/2006/main" noChangeAspect="1"/>
+                  </wp:cNvGraphicFramePr>
+                  <a:graphic xmlns:a="http://schemas.openxmlformats.org/drawingml/2006/main">
+                    <a:graphicData uri="http://schemas.openxmlformats.org/drawingml/2006/picture">
+                      <pic:pic xmlns:pic="http://schemas.openxmlformats.org/drawingml/2006/picture">
+                        <pic:nvPicPr>
+                          <pic:cNvPr id="1202432205" name=""/>
+                          <pic:cNvPicPr/>
+                        </pic:nvPicPr>
+                        <pic:blipFill>
+                          <a:blip r:embed="rId6"/>
+                          <a:stretch>
+                            <a:fillRect/>
+                          </a:stretch>
+                        </pic:blipFill>
+                        <pic:spPr>
+                          <a:xfrm>
+                            <a:off x="0" y="0"/>
+                            <a:ext cx="3492845" cy="4012051"/>
+                          </a:xfrm>
+                          <a:prstGeom prst="rect">
+                            <a:avLst/>
+                          </a:prstGeom>
+                        </pic:spPr>
+                      </pic:pic>
+                    </a:graphicData>
+                  </a:graphic>
+                </wp:inline>
+              </w:drawing>
+            </w:r>
+          </w:p>
+          <w:p>
+            <w:pPr>
+              <w:spacing w:after="0"/>
+            </w:pPr>
+            <w:r>
+              <w:drawing>
+                <wp:inline distT="0" distB="0" distL="0" distR="0" wp14:anchorId="4DD67985" wp14:editId="19F86FE7">
+                  <wp:extent cx="4545856" cy="2962275"/>
+                  <wp:effectExtent l="0" t="0" r="7620" b="0"/>
+                  <wp:docPr id="738231145" name="Imagen 1"/>
+                  <wp:cNvGraphicFramePr>
+                    <a:graphicFrameLocks xmlns:a="http://schemas.openxmlformats.org/drawingml/2006/main" noChangeAspect="1"/>
+                  </wp:cNvGraphicFramePr>
+                  <a:graphic xmlns:a="http://schemas.openxmlformats.org/drawingml/2006/main">
+                    <a:graphicData uri="http://schemas.openxmlformats.org/drawingml/2006/picture">
+                      <pic:pic xmlns:pic="http://schemas.openxmlformats.org/drawingml/2006/picture">
+                        <pic:nvPicPr>
+                          <pic:cNvPr id="738231145" name=""/>
+                          <pic:cNvPicPr/>
+                        </pic:nvPicPr>
+                        <pic:blipFill>
+                          <a:blip r:embed="rId7"/>
+                          <a:stretch>
+                            <a:fillRect/>
+                          </a:stretch>
+                        </pic:blipFill>
+                        <pic:spPr>
+                          <a:xfrm>
+                            <a:off x="0" y="0"/>
+                            <a:ext cx="4547258" cy="2963189"/>
+                          </a:xfrm>
+                          <a:prstGeom prst="rect">
+                            <a:avLst/>
+                          </a:prstGeom>
+                        </pic:spPr>
+                      </pic:pic>
+                    </a:graphicData>
+                  </a:graphic>
+                </wp:inline>
+              </w:drawing>
+            </w:r>
+          </w:p>
+          <w:p>
+            <w:pPr>
+              <w:spacing w:after="0"/>
+            </w:pPr>
+          </w:p>
+          <w:p>
+            <w:pPr>
+              <w:spacing w:after="0"/>
+            </w:pPr>
+            <w:r>
+              <w:t>Diseño PID</w:t>
+            </w:r>
+            <w:r>
+              <w:br/>
+              <w:t>Diseño IPD</w:t>
+            </w:r>
+          </w:p>
+          <w:p>
+            <w:pPr>
+              <w:spacing w:after="0"/>
+            </w:pPr>
+          </w:p>
+        </w:tc>
+      </w:tr>
+    </w:tbl>
+    <w:p/>
+    <w:tbl>
+      <w:tblPr>
+        <w:tblW w:w="0" w:type="auto"/>
+        <w:tblLayout w:type="fixed"/>
+        <w:tblLook w:val="06A0" w:firstRow="1" w:lastRow="0" w:firstColumn="1" w:lastColumn="0" w:noHBand="1" w:noVBand="1"/>
+      </w:tblPr>
+      <w:tblGrid>
+        <w:gridCol w:w="4559"/>
+        <w:gridCol w:w="4649"/>
+      </w:tblGrid>
+      <w:tr>
+        <w:trPr>
+          <w:trHeight w:val="975"/>
+        </w:trPr>
+        <w:tc>
+          <w:tcPr>
+            <w:tcW w:w="4559" w:type="dxa"/>
+            <w:tcBorders>
+              <w:top w:val="single" w:sz="8" w:space="0" w:color="000000" w:themeColor="text1"/>
+              <w:left w:val="single" w:sz="8" w:space="0" w:color="000000" w:themeColor="text1"/>
+              <w:bottom w:val="single" w:sz="8" w:space="0" w:color="000000" w:themeColor="text1"/>
+              <w:right w:val="single" w:sz="8" w:space="0" w:color="000000" w:themeColor="text1"/>
+            </w:tcBorders>
+            <w:tcMar>
+              <w:top w:w="100" w:type="dxa"/>
+              <w:left w:w="100" w:type="dxa"/>
+              <w:bottom w:w="100" w:type="dxa"/>
+              <w:right w:w="100" w:type="dxa"/>
+            </w:tcMar>
+          </w:tcPr>
+          <w:p>
+            <w:pPr>
+              <w:spacing w:after="0"/>
+              <w:jc w:val="center"/>
+            </w:pPr>
+            <w:r>
+              <w:rPr>
+                <w:rFonts w:ascii="Arial" w:eastAsia="Arial" w:hAnsi="Arial" w:cs="Arial"/>
+                <w:b/>
+                <w:bCs/>
+                <w:color w:val="000000" w:themeColor="text1"/>
+                <w:sz w:val="22"/>
+                <w:szCs w:val="22"/>
+              </w:rPr>
+              <w:t>Tecnológico de Costa Rica</w:t>
+            </w:r>
+          </w:p>
+          <w:p>
+            <w:pPr>
+              <w:spacing w:after="0"/>
+              <w:jc w:val="center"/>
+              <w:rPr>
+                <w:rFonts w:ascii="Arial" w:eastAsia="Arial" w:hAnsi="Arial" w:cs="Arial"/>
+                <w:b/>
+                <w:bCs/>
+                <w:color w:val="000000" w:themeColor="text1"/>
+                <w:sz w:val="22"/>
+                <w:szCs w:val="22"/>
+              </w:rPr>
+            </w:pPr>
+            <w:r>
+              <w:rPr>
+                <w:rFonts w:ascii="Arial" w:eastAsia="Arial" w:hAnsi="Arial" w:cs="Arial"/>
+                <w:b/>
+                <w:bCs/>
+                <w:color w:val="000000" w:themeColor="text1"/>
+                <w:sz w:val="22"/>
+                <w:szCs w:val="22"/>
+              </w:rPr>
+              <w:t>Laboratorio de Control Automático</w:t>
+            </w:r>
+          </w:p>
+        </w:tc>
+        <w:tc>
+          <w:tcPr>
+            <w:tcW w:w="4649" w:type="dxa"/>
+            <w:tcBorders>
+              <w:top w:val="single" w:sz="8" w:space="0" w:color="000000" w:themeColor="text1"/>
+              <w:left w:val="single" w:sz="8" w:space="0" w:color="000000" w:themeColor="text1"/>
+              <w:bottom w:val="single" w:sz="8" w:space="0" w:color="000000" w:themeColor="text1"/>
+              <w:right w:val="single" w:sz="8" w:space="0" w:color="000000" w:themeColor="text1"/>
+            </w:tcBorders>
+            <w:tcMar>
+              <w:top w:w="100" w:type="dxa"/>
+              <w:left w:w="100" w:type="dxa"/>
+              <w:bottom w:w="100" w:type="dxa"/>
+              <w:right w:w="100" w:type="dxa"/>
+            </w:tcMar>
+          </w:tcPr>
+          <w:p>
+            <w:pPr>
+              <w:spacing w:after="0"/>
+              <w:jc w:val="center"/>
+            </w:pPr>
+            <w:r>
+              <w:rPr>
+                <w:noProof/>
+              </w:rPr>
+              <w:drawing>
+                <wp:inline distT="0" distB="0" distL="0" distR="0" wp14:anchorId="404C9646" wp14:editId="552DC8E8">
+                  <wp:extent cx="2276475" cy="361950"/>
+                  <wp:effectExtent l="0" t="0" r="0" b="0"/>
+                  <wp:docPr id="1654815447" name="drawing"/>
+                  <wp:cNvGraphicFramePr>
+                    <a:graphicFrameLocks xmlns:a="http://schemas.openxmlformats.org/drawingml/2006/main" noChangeAspect="1"/>
+                  </wp:cNvGraphicFramePr>
+                  <a:graphic xmlns:a="http://schemas.openxmlformats.org/drawingml/2006/main">
+                    <a:graphicData uri="http://schemas.openxmlformats.org/drawingml/2006/picture">
+                      <pic:pic xmlns:pic="http://schemas.openxmlformats.org/drawingml/2006/picture">
+                        <pic:nvPicPr>
+                          <pic:cNvPr id="1288723972" name=""/>
+                          <pic:cNvPicPr/>
+                        </pic:nvPicPr>
+                        <pic:blipFill>
+                          <a:blip r:embed="rId4">
+                            <a:extLst>
+                              <a:ext uri="{28A0092B-C50C-407E-A947-70E740481C1C}">
+                                <a14:useLocalDpi xmlns:a14="http://schemas.microsoft.com/office/drawing/2010/main" val="0"/>
+                              </a:ext>
+                            </a:extLst>
+                          </a:blip>
+                          <a:stretch>
+                            <a:fillRect/>
+                          </a:stretch>
+                        </pic:blipFill>
+                        <pic:spPr>
+                          <a:xfrm>
+                            <a:off x="0" y="0"/>
+                            <a:ext cx="2276475" cy="361950"/>
+                          </a:xfrm>
+                          <a:prstGeom prst="rect">
+                            <a:avLst/>
+                          </a:prstGeom>
+                        </pic:spPr>
+                      </pic:pic>
+                    </a:graphicData>
+                  </a:graphic>
+                </wp:inline>
+              </w:drawing>
+            </w:r>
+          </w:p>
+        </w:tc>
+      </w:tr>
+      <w:tr>
+        <w:trPr>
+          <w:trHeight w:val="540"/>
+        </w:trPr>
+        <w:tc>
+          <w:tcPr>
+            <w:tcW w:w="9208" w:type="dxa"/>
+            <w:gridSpan w:val="2"/>
+            <w:tcBorders>
+              <w:top w:val="single" w:sz="8" w:space="0" w:color="000000" w:themeColor="text1"/>
+              <w:left w:val="single" w:sz="8" w:space="0" w:color="000000" w:themeColor="text1"/>
+              <w:bottom w:val="single" w:sz="8" w:space="0" w:color="000000" w:themeColor="text1"/>
+              <w:right w:val="single" w:sz="8" w:space="0" w:color="000000" w:themeColor="text1"/>
+            </w:tcBorders>
+            <w:tcMar>
+              <w:top w:w="100" w:type="dxa"/>
+              <w:left w:w="100" w:type="dxa"/>
+              <w:bottom w:w="100" w:type="dxa"/>
+              <w:right w:w="100" w:type="dxa"/>
+            </w:tcMar>
+          </w:tcPr>
+          <w:p>
+            <w:pPr>
+              <w:spacing w:after="0"/>
+              <w:jc w:val="center"/>
+            </w:pPr>
+            <w:r>
+              <w:rPr>
+                <w:rFonts w:ascii="Arial" w:eastAsia="Arial" w:hAnsi="Arial" w:cs="Arial"/>
+                <w:b/>
+                <w:bCs/>
+                <w:color w:val="000000" w:themeColor="text1"/>
+                <w:sz w:val="22"/>
+                <w:szCs w:val="22"/>
+              </w:rPr>
+              <w:t xml:space="preserve">Cuaderno de Ingeniería - Grupo </w:t>
+            </w:r>
+            <w:r>
+              <w:rPr>
+                <w:rFonts w:ascii="Arial" w:eastAsia="Arial" w:hAnsi="Arial" w:cs="Arial"/>
+                <w:b/>
+                <w:bCs/>
+                <w:color w:val="000000" w:themeColor="text1"/>
+                <w:sz w:val="22"/>
+                <w:szCs w:val="22"/>
+              </w:rPr>
+              <w:t>B</w:t>
+            </w:r>
+          </w:p>
+        </w:tc>
+      </w:tr>
+      <w:tr>
+        <w:trPr>
+          <w:trHeight w:val="2280"/>
+        </w:trPr>
+        <w:tc>
+          <w:tcPr>
+            <w:tcW w:w="4559" w:type="dxa"/>
+            <w:tcBorders>
+              <w:top w:val="single" w:sz="8" w:space="0" w:color="000000" w:themeColor="text1"/>
+              <w:left w:val="single" w:sz="8" w:space="0" w:color="000000" w:themeColor="text1"/>
+              <w:bottom w:val="single" w:sz="8" w:space="0" w:color="000000" w:themeColor="text1"/>
+              <w:right w:val="single" w:sz="8" w:space="0" w:color="000000" w:themeColor="text1"/>
+            </w:tcBorders>
+            <w:tcMar>
+              <w:top w:w="100" w:type="dxa"/>
+              <w:left w:w="100" w:type="dxa"/>
+              <w:bottom w:w="100" w:type="dxa"/>
+              <w:right w:w="100" w:type="dxa"/>
+            </w:tcMar>
+          </w:tcPr>
+          <w:p>
+            <w:pPr>
+              <w:spacing w:after="0"/>
+              <w:jc w:val="center"/>
+            </w:pPr>
+            <w:r>
+              <w:rPr>
+                <w:rFonts w:ascii="Arial" w:eastAsia="Arial" w:hAnsi="Arial" w:cs="Arial"/>
+                <w:b/>
+                <w:bCs/>
+                <w:color w:val="000000" w:themeColor="text1"/>
+                <w:sz w:val="22"/>
+                <w:szCs w:val="22"/>
+              </w:rPr>
+              <w:t>Integrantes del grupo de trabajo:</w:t>
+            </w:r>
+          </w:p>
+          <w:p>
+            <w:pPr>
+              <w:spacing w:after="0"/>
+              <w:jc w:val="center"/>
+            </w:pPr>
+            <w:r>
+              <w:rPr>
+                <w:rFonts w:ascii="Arial" w:eastAsia="Arial" w:hAnsi="Arial" w:cs="Arial"/>
+                <w:color w:val="000000" w:themeColor="text1"/>
+                <w:sz w:val="22"/>
+                <w:szCs w:val="22"/>
+              </w:rPr>
+              <w:t xml:space="preserve">Eric Castro Velázquez </w:t>
+            </w:r>
+          </w:p>
+          <w:p>
+            <w:pPr>
+              <w:spacing w:after="0"/>
+              <w:jc w:val="center"/>
+              <w:rPr>
+                <w:rFonts w:ascii="Arial" w:eastAsia="Arial" w:hAnsi="Arial" w:cs="Arial"/>
+                <w:color w:val="000000" w:themeColor="text1"/>
+                <w:sz w:val="22"/>
+                <w:szCs w:val="22"/>
+              </w:rPr>
+            </w:pPr>
+            <w:r>
+              <w:rPr>
+                <w:rFonts w:ascii="Arial" w:eastAsia="Arial" w:hAnsi="Arial" w:cs="Arial"/>
+                <w:color w:val="000000" w:themeColor="text1"/>
+                <w:sz w:val="22"/>
+                <w:szCs w:val="22"/>
+              </w:rPr>
+              <w:t>Daniel Chavarría García</w:t>
+            </w:r>
+          </w:p>
+          <w:p>
+            <w:pPr>
+              <w:spacing w:after="0"/>
+              <w:jc w:val="center"/>
+              <w:rPr>
+                <w:rFonts w:ascii="Arial" w:eastAsia="Arial" w:hAnsi="Arial" w:cs="Arial"/>
+                <w:color w:val="000000" w:themeColor="text1"/>
+                <w:sz w:val="22"/>
+                <w:szCs w:val="22"/>
+              </w:rPr>
+            </w:pPr>
+            <w:r>
+              <w:rPr>
+                <w:rFonts w:ascii="Arial" w:eastAsia="Arial" w:hAnsi="Arial" w:cs="Arial"/>
+                <w:color w:val="000000" w:themeColor="text1"/>
+                <w:sz w:val="22"/>
+                <w:szCs w:val="22"/>
+              </w:rPr>
+              <w:t>Esteban Segura García</w:t>
+            </w:r>
+          </w:p>
+          <w:p>
+            <w:pPr>
+              <w:spacing w:after="0"/>
+              <w:jc w:val="center"/>
+              <w:rPr>
+                <w:rFonts w:ascii="Arial" w:eastAsia="Arial" w:hAnsi="Arial" w:cs="Arial"/>
+                <w:color w:val="000000" w:themeColor="text1"/>
+                <w:sz w:val="22"/>
+                <w:szCs w:val="22"/>
+                <w:u w:val="single"/>
+              </w:rPr>
+            </w:pPr>
+          </w:p>
+          <w:p>
+            <w:pPr>
+              <w:spacing w:after="0"/>
+              <w:jc w:val="center"/>
+              <w:rPr>
+                <w:rFonts w:ascii="Arial" w:eastAsia="Arial" w:hAnsi="Arial" w:cs="Arial"/>
+                <w:color w:val="000000" w:themeColor="text1"/>
+                <w:sz w:val="22"/>
+                <w:szCs w:val="22"/>
+              </w:rPr>
+            </w:pPr>
+          </w:p>
+        </w:tc>
+        <w:tc>
+          <w:tcPr>
+            <w:tcW w:w="4649" w:type="dxa"/>
+            <w:tcBorders>
+              <w:top w:val="single" w:sz="8" w:space="0" w:color="000000" w:themeColor="text1"/>
+              <w:left w:val="single" w:sz="8" w:space="0" w:color="000000" w:themeColor="text1"/>
+              <w:bottom w:val="single" w:sz="8" w:space="0" w:color="000000" w:themeColor="text1"/>
+              <w:right w:val="single" w:sz="8" w:space="0" w:color="000000" w:themeColor="text1"/>
+            </w:tcBorders>
+            <w:tcMar>
+              <w:top w:w="100" w:type="dxa"/>
+              <w:left w:w="100" w:type="dxa"/>
+              <w:bottom w:w="100" w:type="dxa"/>
+              <w:right w:w="100" w:type="dxa"/>
+            </w:tcMar>
+          </w:tcPr>
+          <w:p>
+            <w:pPr>
+              <w:spacing w:after="0"/>
+              <w:jc w:val="center"/>
+            </w:pPr>
+            <w:r>
+              <w:rPr>
+                <w:rFonts w:ascii="Arial" w:eastAsia="Arial" w:hAnsi="Arial" w:cs="Arial"/>
+                <w:color w:val="000000" w:themeColor="text1"/>
+                <w:sz w:val="22"/>
+                <w:szCs w:val="22"/>
+              </w:rPr>
+              <w:t xml:space="preserve"> </w:t>
+            </w:r>
+          </w:p>
+          <w:p>
+            <w:pPr>
+              <w:spacing w:after="0"/>
+              <w:jc w:val="center"/>
+            </w:pPr>
+            <w:r>
+              <w:rPr>
+                <w:rFonts w:ascii="Arial" w:eastAsia="Arial" w:hAnsi="Arial" w:cs="Arial"/>
+                <w:color w:val="000000" w:themeColor="text1"/>
+                <w:sz w:val="22"/>
+                <w:szCs w:val="22"/>
+              </w:rPr>
+              <w:t xml:space="preserve"> </w:t>
+            </w:r>
+          </w:p>
+          <w:p>
+            <w:pPr>
+              <w:spacing w:after="0"/>
+            </w:pPr>
+          </w:p>
+          <w:p>
+            <w:pPr>
+              <w:spacing w:after="0"/>
+              <w:jc w:val="center"/>
+            </w:pPr>
+            <w:r>
+              <w:rPr>
+                <w:rFonts w:ascii="Arial" w:eastAsia="Arial" w:hAnsi="Arial" w:cs="Arial"/>
+                <w:color w:val="000000" w:themeColor="text1"/>
+                <w:sz w:val="22"/>
+                <w:szCs w:val="22"/>
+              </w:rPr>
+              <w:t>Aníbal Ruiz Barquero</w:t>
+            </w:r>
+          </w:p>
+          <w:p>
+            <w:pPr>
+              <w:spacing w:after="0"/>
+            </w:pPr>
+          </w:p>
+          <w:p>
+            <w:pPr>
+              <w:spacing w:after="0"/>
+              <w:jc w:val="center"/>
+            </w:pPr>
+            <w:r>
+              <w:rPr>
+                <w:rFonts w:ascii="Arial" w:eastAsia="Arial" w:hAnsi="Arial" w:cs="Arial"/>
+                <w:color w:val="000000" w:themeColor="text1"/>
+                <w:sz w:val="22"/>
+                <w:szCs w:val="22"/>
+              </w:rPr>
+              <w:t xml:space="preserve">  </w:t>
+            </w:r>
+          </w:p>
+        </w:tc>
+      </w:tr>
+      <w:tr>
+        <w:trPr>
+          <w:trHeight w:val="480"/>
+        </w:trPr>
+        <w:tc>
+          <w:tcPr>
+            <w:tcW w:w="4559" w:type="dxa"/>
+            <w:tcBorders>
+              <w:top w:val="single" w:sz="8" w:space="0" w:color="000000" w:themeColor="text1"/>
+              <w:left w:val="single" w:sz="8" w:space="0" w:color="000000" w:themeColor="text1"/>
+              <w:bottom w:val="single" w:sz="8" w:space="0" w:color="000000" w:themeColor="text1"/>
+              <w:right w:val="single" w:sz="8" w:space="0" w:color="000000" w:themeColor="text1"/>
+            </w:tcBorders>
+            <w:tcMar>
+              <w:top w:w="100" w:type="dxa"/>
+              <w:left w:w="100" w:type="dxa"/>
+              <w:bottom w:w="100" w:type="dxa"/>
+              <w:right w:w="100" w:type="dxa"/>
+            </w:tcMar>
+          </w:tcPr>
+          <w:p>
+            <w:pPr>
+              <w:spacing w:after="0"/>
+              <w:jc w:val="center"/>
+            </w:pPr>
+            <w:r>
+              <w:rPr>
+                <w:rFonts w:ascii="Arial" w:eastAsia="Arial" w:hAnsi="Arial" w:cs="Arial"/>
+                <w:b/>
+                <w:bCs/>
+                <w:color w:val="000000" w:themeColor="text1"/>
+                <w:sz w:val="22"/>
+                <w:szCs w:val="22"/>
+              </w:rPr>
+              <w:t>Fechas de trabajo:</w:t>
+            </w:r>
+          </w:p>
+        </w:tc>
+        <w:tc>
+          <w:tcPr>
+            <w:tcW w:w="4649" w:type="dxa"/>
+            <w:tcBorders>
+              <w:top w:val="single" w:sz="8" w:space="0" w:color="000000" w:themeColor="text1"/>
+              <w:left w:val="single" w:sz="8" w:space="0" w:color="000000" w:themeColor="text1"/>
+              <w:bottom w:val="single" w:sz="8" w:space="0" w:color="000000" w:themeColor="text1"/>
+              <w:right w:val="single" w:sz="8" w:space="0" w:color="000000" w:themeColor="text1"/>
+            </w:tcBorders>
+            <w:tcMar>
+              <w:top w:w="100" w:type="dxa"/>
+              <w:left w:w="100" w:type="dxa"/>
+              <w:bottom w:w="100" w:type="dxa"/>
+              <w:right w:w="100" w:type="dxa"/>
+            </w:tcMar>
+          </w:tcPr>
+          <w:p>
+            <w:pPr>
+              <w:spacing w:after="0"/>
+              <w:jc w:val="center"/>
+            </w:pPr>
+            <w:r>
+              <w:rPr>
+                <w:rFonts w:ascii="Arial" w:eastAsia="Arial" w:hAnsi="Arial" w:cs="Arial"/>
+                <w:color w:val="000000" w:themeColor="text1"/>
+                <w:sz w:val="22"/>
+                <w:szCs w:val="22"/>
+              </w:rPr>
+              <w:t>4 de septiembre del 2025</w:t>
+            </w:r>
+          </w:p>
+        </w:tc>
+      </w:tr>
+      <w:tr>
+        <w:trPr>
+          <w:trHeight w:val="480"/>
+        </w:trPr>
+        <w:tc>
+          <w:tcPr>
+            <w:tcW w:w="9208" w:type="dxa"/>
+            <w:gridSpan w:val="2"/>
+            <w:tcBorders>
+              <w:top w:val="single" w:sz="8" w:space="0" w:color="000000" w:themeColor="text1"/>
+              <w:left w:val="single" w:sz="8" w:space="0" w:color="000000" w:themeColor="text1"/>
+              <w:bottom w:val="single" w:sz="8" w:space="0" w:color="000000" w:themeColor="text1"/>
+              <w:right w:val="single" w:sz="8" w:space="0" w:color="000000" w:themeColor="text1"/>
+            </w:tcBorders>
+            <w:tcMar>
+              <w:top w:w="100" w:type="dxa"/>
+              <w:left w:w="100" w:type="dxa"/>
+              <w:bottom w:w="100" w:type="dxa"/>
+              <w:right w:w="100" w:type="dxa"/>
+            </w:tcMar>
+          </w:tcPr>
+          <w:p>
+            <w:pPr>
+              <w:spacing w:after="0"/>
+            </w:pPr>
+          </w:p>
+          <w:p>
+            <w:pPr>
+              <w:spacing w:after="0"/>
+              <w:jc w:val="center"/>
+              <w:rPr>
+                <w:rFonts w:ascii="Arial" w:eastAsia="Arial" w:hAnsi="Arial" w:cs="Arial"/>
+                <w:b/>
+                <w:bCs/>
+                <w:color w:val="000000" w:themeColor="text1"/>
+                <w:sz w:val="22"/>
+                <w:szCs w:val="22"/>
+              </w:rPr>
+            </w:pPr>
+            <w:r>
+              <w:rPr>
+                <w:rFonts w:ascii="Arial" w:eastAsia="Arial" w:hAnsi="Arial" w:cs="Arial"/>
+                <w:b/>
+                <w:bCs/>
+                <w:color w:val="000000" w:themeColor="text1"/>
+                <w:sz w:val="22"/>
+                <w:szCs w:val="22"/>
+              </w:rPr>
+              <w:t xml:space="preserve">Laboratorio #: </w:t>
+            </w:r>
+            <w:proofErr w:type="gramStart"/>
+            <w:r>
+              <w:rPr>
+                <w:rFonts w:ascii="Arial" w:eastAsia="Arial" w:hAnsi="Arial" w:cs="Arial"/>
+                <w:b/>
+                <w:bCs/>
+                <w:color w:val="000000" w:themeColor="text1"/>
+                <w:sz w:val="22"/>
+                <w:szCs w:val="22"/>
+              </w:rPr>
+              <w:t xml:space="preserve">( </w:t>
+            </w:r>
+            <w:r>
+              <w:rPr>
+                <w:rFonts w:ascii="Arial" w:eastAsia="Arial" w:hAnsi="Arial" w:cs="Arial"/>
+                <w:b/>
+                <w:bCs/>
+                <w:color w:val="000000" w:themeColor="text1"/>
+                <w:sz w:val="22"/>
+                <w:szCs w:val="22"/>
+              </w:rPr>
+              <w:t>PAMH</w:t>
+            </w:r>
+            <w:proofErr w:type="gramEnd"/>
+            <w:r>
+              <w:rPr>
+                <w:rFonts w:ascii="Arial" w:eastAsia="Arial" w:hAnsi="Arial" w:cs="Arial"/>
+                <w:b/>
+                <w:bCs/>
+                <w:color w:val="000000" w:themeColor="text1"/>
+                <w:sz w:val="22"/>
+                <w:szCs w:val="22"/>
+              </w:rPr>
+              <w:t>)</w:t>
+            </w:r>
+          </w:p>
+        </w:tc>
+      </w:tr>
+      <w:tr>
+        <w:trPr>
+          <w:trHeight w:val="480"/>
+        </w:trPr>
+        <w:tc>
+          <w:tcPr>
+            <w:tcW w:w="9208" w:type="dxa"/>
+            <w:gridSpan w:val="2"/>
+            <w:tcBorders>
+              <w:top w:val="single" w:sz="8" w:space="0" w:color="000000" w:themeColor="text1"/>
+              <w:left w:val="single" w:sz="8" w:space="0" w:color="000000" w:themeColor="text1"/>
+              <w:bottom w:val="single" w:sz="8" w:space="0" w:color="000000" w:themeColor="text1"/>
+              <w:right w:val="single" w:sz="8" w:space="0" w:color="000000" w:themeColor="text1"/>
+            </w:tcBorders>
+            <w:tcMar>
+              <w:top w:w="100" w:type="dxa"/>
+              <w:left w:w="100" w:type="dxa"/>
+              <w:bottom w:w="100" w:type="dxa"/>
+              <w:right w:w="100" w:type="dxa"/>
+            </w:tcMar>
+          </w:tcPr>
+          <w:p>
+            <w:pPr>
+              <w:spacing w:after="0"/>
+              <w:jc w:val="center"/>
+              <w:rPr>
+                <w:rFonts w:ascii="Arial" w:eastAsia="Arial" w:hAnsi="Arial" w:cs="Arial"/>
+                <w:b/>
+                <w:bCs/>
+                <w:color w:val="000000" w:themeColor="text1"/>
+              </w:rPr>
+            </w:pPr>
+            <w:r>
+              <w:rPr>
+                <w:rFonts w:ascii="Arial" w:eastAsia="Arial" w:hAnsi="Arial" w:cs="Arial"/>
+                <w:b/>
+                <w:bCs/>
+                <w:color w:val="000000" w:themeColor="text1"/>
+              </w:rPr>
+              <w:t>Reporte de actividades</w:t>
+            </w:r>
+          </w:p>
+          <w:p>
+            <w:pPr>
+              <w:spacing w:after="0"/>
+            </w:pPr>
+            <w:r>
+              <w:rPr>
+                <w:rFonts w:ascii="Arial" w:eastAsia="Arial" w:hAnsi="Arial" w:cs="Arial"/>
+                <w:b/>
+                <w:bCs/>
+                <w:color w:val="000000" w:themeColor="text1"/>
+              </w:rPr>
+              <w:t xml:space="preserve">Actividad:  </w:t>
+            </w:r>
+            <w:r>
+              <w:rPr>
+                <w:rFonts w:ascii="Arial" w:eastAsia="Arial" w:hAnsi="Arial" w:cs="Arial"/>
+                <w:color w:val="000000" w:themeColor="text1"/>
+              </w:rPr>
+              <w:t>Prueba de controladores</w:t>
+            </w:r>
+          </w:p>
+          <w:p>
+            <w:pPr>
+              <w:spacing w:after="0"/>
+            </w:pPr>
+            <w:r>
+              <w:t xml:space="preserve">Se realiza el </w:t>
+            </w:r>
+            <w:r>
+              <w:t>15</w:t>
+            </w:r>
+            <w:r>
+              <w:t xml:space="preserve"> de abril </w:t>
+            </w:r>
+            <w:r>
+              <w:t xml:space="preserve">la prueba de los controladores. Para el caso del controlador REI-LQR, se ajustaron los parámetros en Matlab para poder conseguir las especificaciones en planta, por ende, los resultados, aunque no cumplen, si cumplen en la planta física. La siguiente figura corresponde al controlador REI-LQR evaluado en el </w:t>
+            </w:r>
+            <w:proofErr w:type="spellStart"/>
+            <w:r>
+              <w:t>tec</w:t>
+            </w:r>
+            <w:proofErr w:type="spellEnd"/>
+            <w:r>
+              <w:t xml:space="preserve"> digital.</w:t>
+            </w:r>
+          </w:p>
+          <w:p>
+            <w:pPr>
+              <w:spacing w:after="0"/>
+            </w:pPr>
+          </w:p>
+          <w:p>
+            <w:pPr>
+              <w:spacing w:after="0"/>
+            </w:pPr>
+            <w:r>
+              <w:lastRenderedPageBreak/>
+              <w:drawing>
+                <wp:inline distT="0" distB="0" distL="0" distR="0" wp14:anchorId="36186C61" wp14:editId="731F1995">
+                  <wp:extent cx="4979121" cy="3076575"/>
+                  <wp:effectExtent l="0" t="0" r="0" b="0"/>
+                  <wp:docPr id="45593093" name="Imagen 1"/>
+                  <wp:cNvGraphicFramePr>
+                    <a:graphicFrameLocks xmlns:a="http://schemas.openxmlformats.org/drawingml/2006/main" noChangeAspect="1"/>
+                  </wp:cNvGraphicFramePr>
+                  <a:graphic xmlns:a="http://schemas.openxmlformats.org/drawingml/2006/main">
+                    <a:graphicData uri="http://schemas.openxmlformats.org/drawingml/2006/picture">
+                      <pic:pic xmlns:pic="http://schemas.openxmlformats.org/drawingml/2006/picture">
+                        <pic:nvPicPr>
+                          <pic:cNvPr id="45593093" name=""/>
+                          <pic:cNvPicPr/>
+                        </pic:nvPicPr>
+                        <pic:blipFill>
+                          <a:blip r:embed="rId8"/>
+                          <a:stretch>
+                            <a:fillRect/>
+                          </a:stretch>
+                        </pic:blipFill>
+                        <pic:spPr>
+                          <a:xfrm>
+                            <a:off x="0" y="0"/>
+                            <a:ext cx="4979956" cy="3077091"/>
+                          </a:xfrm>
+                          <a:prstGeom prst="rect">
+                            <a:avLst/>
+                          </a:prstGeom>
+                        </pic:spPr>
+                      </pic:pic>
+                    </a:graphicData>
+                  </a:graphic>
+                </wp:inline>
+              </w:drawing>
+            </w:r>
+          </w:p>
+          <w:p>
+            <w:pPr>
+              <w:spacing w:after="0"/>
+            </w:pPr>
+            <w:r>
+              <w:drawing>
+                <wp:inline distT="0" distB="0" distL="0" distR="0" wp14:anchorId="5EA5355F" wp14:editId="7CC9919A">
+                  <wp:extent cx="4979035" cy="2803471"/>
+                  <wp:effectExtent l="0" t="0" r="0" b="0"/>
+                  <wp:docPr id="644887331" name="Imagen 1"/>
+                  <wp:cNvGraphicFramePr>
+                    <a:graphicFrameLocks xmlns:a="http://schemas.openxmlformats.org/drawingml/2006/main" noChangeAspect="1"/>
+                  </wp:cNvGraphicFramePr>
+                  <a:graphic xmlns:a="http://schemas.openxmlformats.org/drawingml/2006/main">
+                    <a:graphicData uri="http://schemas.openxmlformats.org/drawingml/2006/picture">
+                      <pic:pic xmlns:pic="http://schemas.openxmlformats.org/drawingml/2006/picture">
+                        <pic:nvPicPr>
+                          <pic:cNvPr id="644887331" name=""/>
+                          <pic:cNvPicPr/>
+                        </pic:nvPicPr>
+                        <pic:blipFill>
+                          <a:blip r:embed="rId9"/>
+                          <a:stretch>
+                            <a:fillRect/>
+                          </a:stretch>
+                        </pic:blipFill>
+                        <pic:spPr>
+                          <a:xfrm>
+                            <a:off x="0" y="0"/>
+                            <a:ext cx="4983979" cy="2806255"/>
+                          </a:xfrm>
+                          <a:prstGeom prst="rect">
+                            <a:avLst/>
+                          </a:prstGeom>
+                        </pic:spPr>
+                      </pic:pic>
+                    </a:graphicData>
+                  </a:graphic>
+                </wp:inline>
+              </w:drawing>
+            </w:r>
+          </w:p>
+          <w:p>
+            <w:pPr>
+              <w:spacing w:after="0"/>
+            </w:pPr>
+          </w:p>
+        </w:tc>
+      </w:tr>
+    </w:tbl>
+    <w:p/>
+    <w:p>
+      <w:r>
+        <w:br w:type="page"/>
+      </w:r>
+    </w:p>
+    <w:tbl>
+      <w:tblPr>
+        <w:tblW w:w="0" w:type="auto"/>
+        <w:tblLayout w:type="fixed"/>
+        <w:tblLook w:val="06A0" w:firstRow="1" w:lastRow="0" w:firstColumn="1" w:lastColumn="0" w:noHBand="1" w:noVBand="1"/>
+      </w:tblPr>
+      <w:tblGrid>
+        <w:gridCol w:w="4559"/>
+        <w:gridCol w:w="4649"/>
+      </w:tblGrid>
+      <w:tr>
+        <w:trPr>
+          <w:trHeight w:val="975"/>
+        </w:trPr>
+        <w:tc>
+          <w:tcPr>
+            <w:tcW w:w="4559" w:type="dxa"/>
+            <w:tcBorders>
+              <w:top w:val="single" w:sz="8" w:space="0" w:color="000000" w:themeColor="text1"/>
+              <w:left w:val="single" w:sz="8" w:space="0" w:color="000000" w:themeColor="text1"/>
+              <w:bottom w:val="single" w:sz="8" w:space="0" w:color="000000" w:themeColor="text1"/>
+              <w:right w:val="single" w:sz="8" w:space="0" w:color="000000" w:themeColor="text1"/>
+            </w:tcBorders>
+            <w:tcMar>
+              <w:top w:w="100" w:type="dxa"/>
+              <w:left w:w="100" w:type="dxa"/>
+              <w:bottom w:w="100" w:type="dxa"/>
+              <w:right w:w="100" w:type="dxa"/>
+            </w:tcMar>
+          </w:tcPr>
+          <w:p>
+            <w:pPr>
+              <w:spacing w:after="0"/>
+              <w:jc w:val="center"/>
+            </w:pPr>
+            <w:r>
+              <w:rPr>
+                <w:rFonts w:ascii="Arial" w:eastAsia="Arial" w:hAnsi="Arial" w:cs="Arial"/>
+                <w:b/>
+                <w:bCs/>
+                <w:color w:val="000000" w:themeColor="text1"/>
+                <w:sz w:val="22"/>
+                <w:szCs w:val="22"/>
+              </w:rPr>
+              <w:lastRenderedPageBreak/>
+              <w:t>Tecnológico de Costa Rica</w:t>
+            </w:r>
+          </w:p>
+          <w:p>
+            <w:pPr>
+              <w:spacing w:after="0"/>
+              <w:jc w:val="center"/>
+              <w:rPr>
+                <w:rFonts w:ascii="Arial" w:eastAsia="Arial" w:hAnsi="Arial" w:cs="Arial"/>
+                <w:b/>
+                <w:bCs/>
+                <w:color w:val="000000" w:themeColor="text1"/>
+                <w:sz w:val="22"/>
+                <w:szCs w:val="22"/>
+              </w:rPr>
+            </w:pPr>
+            <w:r>
+              <w:rPr>
+                <w:rFonts w:ascii="Arial" w:eastAsia="Arial" w:hAnsi="Arial" w:cs="Arial"/>
+                <w:b/>
+                <w:bCs/>
+                <w:color w:val="000000" w:themeColor="text1"/>
+                <w:sz w:val="22"/>
+                <w:szCs w:val="22"/>
+              </w:rPr>
+              <w:t>Laboratorio de Control Automático</w:t>
+            </w:r>
+          </w:p>
+        </w:tc>
+        <w:tc>
+          <w:tcPr>
+            <w:tcW w:w="4649" w:type="dxa"/>
+            <w:tcBorders>
+              <w:top w:val="single" w:sz="8" w:space="0" w:color="000000" w:themeColor="text1"/>
+              <w:left w:val="single" w:sz="8" w:space="0" w:color="000000" w:themeColor="text1"/>
+              <w:bottom w:val="single" w:sz="8" w:space="0" w:color="000000" w:themeColor="text1"/>
+              <w:right w:val="single" w:sz="8" w:space="0" w:color="000000" w:themeColor="text1"/>
+            </w:tcBorders>
+            <w:tcMar>
+              <w:top w:w="100" w:type="dxa"/>
+              <w:left w:w="100" w:type="dxa"/>
+              <w:bottom w:w="100" w:type="dxa"/>
+              <w:right w:w="100" w:type="dxa"/>
+            </w:tcMar>
+          </w:tcPr>
+          <w:p>
+            <w:pPr>
+              <w:spacing w:after="0"/>
+              <w:jc w:val="center"/>
+            </w:pPr>
+            <w:r>
+              <w:rPr>
+                <w:noProof/>
+              </w:rPr>
+              <w:drawing>
+                <wp:inline distT="0" distB="0" distL="0" distR="0" wp14:anchorId="08538A46" wp14:editId="07EC4C77">
+                  <wp:extent cx="2276475" cy="361950"/>
+                  <wp:effectExtent l="0" t="0" r="0" b="0"/>
+                  <wp:docPr id="1042834442" name="drawing"/>
+                  <wp:cNvGraphicFramePr>
+                    <a:graphicFrameLocks xmlns:a="http://schemas.openxmlformats.org/drawingml/2006/main" noChangeAspect="1"/>
+                  </wp:cNvGraphicFramePr>
+                  <a:graphic xmlns:a="http://schemas.openxmlformats.org/drawingml/2006/main">
+                    <a:graphicData uri="http://schemas.openxmlformats.org/drawingml/2006/picture">
+                      <pic:pic xmlns:pic="http://schemas.openxmlformats.org/drawingml/2006/picture">
+                        <pic:nvPicPr>
+                          <pic:cNvPr id="1288723972" name=""/>
+                          <pic:cNvPicPr/>
+                        </pic:nvPicPr>
+                        <pic:blipFill>
+                          <a:blip r:embed="rId4">
+                            <a:extLst>
+                              <a:ext uri="{28A0092B-C50C-407E-A947-70E740481C1C}">
+                                <a14:useLocalDpi xmlns:a14="http://schemas.microsoft.com/office/drawing/2010/main" val="0"/>
+                              </a:ext>
+                            </a:extLst>
+                          </a:blip>
+                          <a:stretch>
+                            <a:fillRect/>
+                          </a:stretch>
+                        </pic:blipFill>
+                        <pic:spPr>
+                          <a:xfrm>
+                            <a:off x="0" y="0"/>
+                            <a:ext cx="2276475" cy="361950"/>
+                          </a:xfrm>
+                          <a:prstGeom prst="rect">
+                            <a:avLst/>
+                          </a:prstGeom>
+                        </pic:spPr>
+                      </pic:pic>
+                    </a:graphicData>
+                  </a:graphic>
+                </wp:inline>
+              </w:drawing>
+            </w:r>
+          </w:p>
+        </w:tc>
+      </w:tr>
+      <w:tr>
+        <w:trPr>
+          <w:trHeight w:val="540"/>
+        </w:trPr>
+        <w:tc>
+          <w:tcPr>
+            <w:tcW w:w="9208" w:type="dxa"/>
+            <w:gridSpan w:val="2"/>
+            <w:tcBorders>
+              <w:top w:val="single" w:sz="8" w:space="0" w:color="000000" w:themeColor="text1"/>
+              <w:left w:val="single" w:sz="8" w:space="0" w:color="000000" w:themeColor="text1"/>
+              <w:bottom w:val="single" w:sz="8" w:space="0" w:color="000000" w:themeColor="text1"/>
+              <w:right w:val="single" w:sz="8" w:space="0" w:color="000000" w:themeColor="text1"/>
+            </w:tcBorders>
+            <w:tcMar>
+              <w:top w:w="100" w:type="dxa"/>
+              <w:left w:w="100" w:type="dxa"/>
+              <w:bottom w:w="100" w:type="dxa"/>
+              <w:right w:w="100" w:type="dxa"/>
+            </w:tcMar>
+          </w:tcPr>
+          <w:p>
+            <w:pPr>
+              <w:spacing w:after="0"/>
+              <w:jc w:val="center"/>
+            </w:pPr>
+            <w:r>
+              <w:rPr>
+                <w:rFonts w:ascii="Arial" w:eastAsia="Arial" w:hAnsi="Arial" w:cs="Arial"/>
+                <w:b/>
+                <w:bCs/>
+                <w:color w:val="000000" w:themeColor="text1"/>
+                <w:sz w:val="22"/>
+                <w:szCs w:val="22"/>
+              </w:rPr>
+              <w:t xml:space="preserve">Cuaderno de Ingeniería - Grupo </w:t>
+            </w:r>
+            <w:r>
+              <w:rPr>
+                <w:rFonts w:ascii="Arial" w:eastAsia="Arial" w:hAnsi="Arial" w:cs="Arial"/>
+                <w:b/>
+                <w:bCs/>
+                <w:color w:val="000000" w:themeColor="text1"/>
+                <w:sz w:val="22"/>
+                <w:szCs w:val="22"/>
+              </w:rPr>
+              <w:t>B</w:t>
+            </w:r>
+          </w:p>
+        </w:tc>
+      </w:tr>
+      <w:tr>
+        <w:trPr>
+          <w:trHeight w:val="2280"/>
+        </w:trPr>
+        <w:tc>
+          <w:tcPr>
+            <w:tcW w:w="4559" w:type="dxa"/>
+            <w:tcBorders>
+              <w:top w:val="single" w:sz="8" w:space="0" w:color="000000" w:themeColor="text1"/>
+              <w:left w:val="single" w:sz="8" w:space="0" w:color="000000" w:themeColor="text1"/>
+              <w:bottom w:val="single" w:sz="8" w:space="0" w:color="000000" w:themeColor="text1"/>
+              <w:right w:val="single" w:sz="8" w:space="0" w:color="000000" w:themeColor="text1"/>
+            </w:tcBorders>
+            <w:tcMar>
+              <w:top w:w="100" w:type="dxa"/>
+              <w:left w:w="100" w:type="dxa"/>
+              <w:bottom w:w="100" w:type="dxa"/>
+              <w:right w:w="100" w:type="dxa"/>
+            </w:tcMar>
+          </w:tcPr>
+          <w:p>
+            <w:pPr>
+              <w:spacing w:after="0"/>
+              <w:jc w:val="center"/>
+            </w:pPr>
+            <w:r>
+              <w:rPr>
+                <w:rFonts w:ascii="Arial" w:eastAsia="Arial" w:hAnsi="Arial" w:cs="Arial"/>
+                <w:b/>
+                <w:bCs/>
+                <w:color w:val="000000" w:themeColor="text1"/>
+                <w:sz w:val="22"/>
+                <w:szCs w:val="22"/>
+              </w:rPr>
+              <w:t>Integrantes del grupo de trabajo:</w:t>
+            </w:r>
+          </w:p>
+          <w:p>
+            <w:pPr>
+              <w:spacing w:after="0"/>
+              <w:jc w:val="center"/>
+            </w:pPr>
+            <w:r>
+              <w:rPr>
+                <w:rFonts w:ascii="Arial" w:eastAsia="Arial" w:hAnsi="Arial" w:cs="Arial"/>
+                <w:color w:val="000000" w:themeColor="text1"/>
+                <w:sz w:val="22"/>
+                <w:szCs w:val="22"/>
+              </w:rPr>
+              <w:t xml:space="preserve">Eric Castro Velázquez </w:t>
+            </w:r>
+          </w:p>
+          <w:p>
+            <w:pPr>
+              <w:spacing w:after="0"/>
+              <w:jc w:val="center"/>
+              <w:rPr>
+                <w:rFonts w:ascii="Arial" w:eastAsia="Arial" w:hAnsi="Arial" w:cs="Arial"/>
+                <w:color w:val="000000" w:themeColor="text1"/>
+                <w:sz w:val="22"/>
+                <w:szCs w:val="22"/>
+              </w:rPr>
+            </w:pPr>
+            <w:r>
+              <w:rPr>
+                <w:rFonts w:ascii="Arial" w:eastAsia="Arial" w:hAnsi="Arial" w:cs="Arial"/>
+                <w:color w:val="000000" w:themeColor="text1"/>
+                <w:sz w:val="22"/>
+                <w:szCs w:val="22"/>
+              </w:rPr>
+              <w:t>Daniel Chavarría García</w:t>
+            </w:r>
+          </w:p>
+          <w:p>
+            <w:pPr>
+              <w:spacing w:after="0"/>
+              <w:jc w:val="center"/>
+              <w:rPr>
+                <w:rFonts w:ascii="Arial" w:eastAsia="Arial" w:hAnsi="Arial" w:cs="Arial"/>
+                <w:color w:val="000000" w:themeColor="text1"/>
+                <w:sz w:val="22"/>
+                <w:szCs w:val="22"/>
+              </w:rPr>
+            </w:pPr>
+            <w:r>
+              <w:rPr>
+                <w:rFonts w:ascii="Arial" w:eastAsia="Arial" w:hAnsi="Arial" w:cs="Arial"/>
+                <w:color w:val="000000" w:themeColor="text1"/>
+                <w:sz w:val="22"/>
+                <w:szCs w:val="22"/>
+              </w:rPr>
+              <w:t>Esteban Segura García</w:t>
+            </w:r>
+          </w:p>
+          <w:p>
+            <w:pPr>
+              <w:spacing w:after="0"/>
+              <w:jc w:val="center"/>
+              <w:rPr>
+                <w:rFonts w:ascii="Arial" w:eastAsia="Arial" w:hAnsi="Arial" w:cs="Arial"/>
+                <w:color w:val="000000" w:themeColor="text1"/>
+                <w:sz w:val="22"/>
+                <w:szCs w:val="22"/>
+              </w:rPr>
+            </w:pPr>
+          </w:p>
+          <w:p>
+            <w:pPr>
+              <w:spacing w:after="0"/>
+              <w:jc w:val="center"/>
+              <w:rPr>
+                <w:rFonts w:ascii="Arial" w:eastAsia="Arial" w:hAnsi="Arial" w:cs="Arial"/>
+                <w:color w:val="000000" w:themeColor="text1"/>
+                <w:sz w:val="22"/>
+                <w:szCs w:val="22"/>
+              </w:rPr>
+            </w:pPr>
+          </w:p>
+        </w:tc>
+        <w:tc>
+          <w:tcPr>
+            <w:tcW w:w="4649" w:type="dxa"/>
+            <w:tcBorders>
+              <w:top w:val="single" w:sz="8" w:space="0" w:color="000000" w:themeColor="text1"/>
+              <w:left w:val="single" w:sz="8" w:space="0" w:color="000000" w:themeColor="text1"/>
+              <w:bottom w:val="single" w:sz="8" w:space="0" w:color="000000" w:themeColor="text1"/>
+              <w:right w:val="single" w:sz="8" w:space="0" w:color="000000" w:themeColor="text1"/>
+            </w:tcBorders>
+            <w:tcMar>
+              <w:top w:w="100" w:type="dxa"/>
+              <w:left w:w="100" w:type="dxa"/>
+              <w:bottom w:w="100" w:type="dxa"/>
+              <w:right w:w="100" w:type="dxa"/>
+            </w:tcMar>
+          </w:tcPr>
+          <w:p>
+            <w:pPr>
+              <w:spacing w:after="0"/>
+              <w:jc w:val="center"/>
+            </w:pPr>
+            <w:r>
+              <w:rPr>
+                <w:rFonts w:ascii="Arial" w:eastAsia="Arial" w:hAnsi="Arial" w:cs="Arial"/>
+                <w:color w:val="000000" w:themeColor="text1"/>
+                <w:sz w:val="22"/>
+                <w:szCs w:val="22"/>
+              </w:rPr>
+              <w:t xml:space="preserve"> </w:t>
+            </w:r>
+          </w:p>
+          <w:p>
+            <w:pPr>
+              <w:spacing w:after="0"/>
+              <w:jc w:val="center"/>
+            </w:pPr>
+            <w:r>
+              <w:rPr>
+                <w:rFonts w:ascii="Arial" w:eastAsia="Arial" w:hAnsi="Arial" w:cs="Arial"/>
+                <w:color w:val="000000" w:themeColor="text1"/>
+                <w:sz w:val="22"/>
+                <w:szCs w:val="22"/>
+              </w:rPr>
+              <w:t xml:space="preserve"> </w:t>
+            </w:r>
+          </w:p>
+          <w:p>
+            <w:pPr>
+              <w:spacing w:after="0"/>
+            </w:pPr>
+          </w:p>
+          <w:p>
+            <w:pPr>
+              <w:spacing w:after="0"/>
+              <w:jc w:val="center"/>
+            </w:pPr>
+            <w:r>
+              <w:rPr>
+                <w:rFonts w:ascii="Arial" w:eastAsia="Arial" w:hAnsi="Arial" w:cs="Arial"/>
+                <w:color w:val="000000" w:themeColor="text1"/>
+                <w:sz w:val="22"/>
+                <w:szCs w:val="22"/>
+              </w:rPr>
+              <w:t>Aníbal Ruiz Barquero</w:t>
+            </w:r>
+          </w:p>
+          <w:p>
+            <w:pPr>
+              <w:spacing w:after="0"/>
+            </w:pPr>
+          </w:p>
+          <w:p>
+            <w:pPr>
+              <w:spacing w:after="0"/>
+              <w:jc w:val="center"/>
+            </w:pPr>
+            <w:r>
+              <w:rPr>
+                <w:rFonts w:ascii="Arial" w:eastAsia="Arial" w:hAnsi="Arial" w:cs="Arial"/>
+                <w:color w:val="000000" w:themeColor="text1"/>
+                <w:sz w:val="22"/>
+                <w:szCs w:val="22"/>
+              </w:rPr>
+              <w:t xml:space="preserve">  </w:t>
+            </w:r>
+          </w:p>
+        </w:tc>
+      </w:tr>
+      <w:tr>
+        <w:trPr>
+          <w:trHeight w:val="480"/>
+        </w:trPr>
+        <w:tc>
+          <w:tcPr>
+            <w:tcW w:w="4559" w:type="dxa"/>
+            <w:tcBorders>
+              <w:top w:val="single" w:sz="8" w:space="0" w:color="000000" w:themeColor="text1"/>
+              <w:left w:val="single" w:sz="8" w:space="0" w:color="000000" w:themeColor="text1"/>
+              <w:bottom w:val="single" w:sz="8" w:space="0" w:color="000000" w:themeColor="text1"/>
+              <w:right w:val="single" w:sz="8" w:space="0" w:color="000000" w:themeColor="text1"/>
+            </w:tcBorders>
+            <w:tcMar>
+              <w:top w:w="100" w:type="dxa"/>
+              <w:left w:w="100" w:type="dxa"/>
+              <w:bottom w:w="100" w:type="dxa"/>
+              <w:right w:w="100" w:type="dxa"/>
+            </w:tcMar>
+          </w:tcPr>
+          <w:p>
+            <w:pPr>
+              <w:spacing w:after="0"/>
+              <w:jc w:val="center"/>
+            </w:pPr>
+            <w:r>
+              <w:rPr>
+                <w:rFonts w:ascii="Arial" w:eastAsia="Arial" w:hAnsi="Arial" w:cs="Arial"/>
+                <w:b/>
+                <w:bCs/>
+                <w:color w:val="000000" w:themeColor="text1"/>
+                <w:sz w:val="22"/>
+                <w:szCs w:val="22"/>
+              </w:rPr>
+              <w:t>Fechas de trabajo:</w:t>
+            </w:r>
+          </w:p>
+        </w:tc>
+        <w:tc>
+          <w:tcPr>
+            <w:tcW w:w="4649" w:type="dxa"/>
+            <w:tcBorders>
+              <w:top w:val="single" w:sz="8" w:space="0" w:color="000000" w:themeColor="text1"/>
+              <w:left w:val="single" w:sz="8" w:space="0" w:color="000000" w:themeColor="text1"/>
+              <w:bottom w:val="single" w:sz="8" w:space="0" w:color="000000" w:themeColor="text1"/>
+              <w:right w:val="single" w:sz="8" w:space="0" w:color="000000" w:themeColor="text1"/>
+            </w:tcBorders>
+            <w:tcMar>
+              <w:top w:w="100" w:type="dxa"/>
+              <w:left w:w="100" w:type="dxa"/>
+              <w:bottom w:w="100" w:type="dxa"/>
+              <w:right w:w="100" w:type="dxa"/>
+            </w:tcMar>
+          </w:tcPr>
+          <w:p>
+            <w:pPr>
+              <w:spacing w:after="0"/>
+              <w:jc w:val="center"/>
+            </w:pPr>
+            <w:r>
+              <w:rPr>
+                <w:rFonts w:ascii="Arial" w:eastAsia="Arial" w:hAnsi="Arial" w:cs="Arial"/>
+                <w:color w:val="000000" w:themeColor="text1"/>
+                <w:sz w:val="22"/>
+                <w:szCs w:val="22"/>
+              </w:rPr>
+              <w:t>4 de septiembre del 2025</w:t>
+            </w:r>
+          </w:p>
+        </w:tc>
+      </w:tr>
+      <w:tr>
+        <w:trPr>
+          <w:trHeight w:val="480"/>
+        </w:trPr>
+        <w:tc>
+          <w:tcPr>
+            <w:tcW w:w="9208" w:type="dxa"/>
+            <w:gridSpan w:val="2"/>
+            <w:tcBorders>
+              <w:top w:val="single" w:sz="8" w:space="0" w:color="000000" w:themeColor="text1"/>
+              <w:left w:val="single" w:sz="8" w:space="0" w:color="000000" w:themeColor="text1"/>
+              <w:bottom w:val="single" w:sz="8" w:space="0" w:color="000000" w:themeColor="text1"/>
+              <w:right w:val="single" w:sz="8" w:space="0" w:color="000000" w:themeColor="text1"/>
+            </w:tcBorders>
+            <w:tcMar>
+              <w:top w:w="100" w:type="dxa"/>
+              <w:left w:w="100" w:type="dxa"/>
+              <w:bottom w:w="100" w:type="dxa"/>
+              <w:right w:w="100" w:type="dxa"/>
+            </w:tcMar>
+          </w:tcPr>
+          <w:p>
+            <w:pPr>
+              <w:spacing w:after="0"/>
+            </w:pPr>
+          </w:p>
+          <w:p>
+            <w:pPr>
+              <w:spacing w:after="0"/>
+              <w:jc w:val="center"/>
+              <w:rPr>
+                <w:rFonts w:ascii="Arial" w:eastAsia="Arial" w:hAnsi="Arial" w:cs="Arial"/>
+                <w:b/>
+                <w:bCs/>
+                <w:color w:val="000000" w:themeColor="text1"/>
+                <w:sz w:val="22"/>
+                <w:szCs w:val="22"/>
+              </w:rPr>
+            </w:pPr>
+            <w:r>
+              <w:rPr>
+                <w:rFonts w:ascii="Arial" w:eastAsia="Arial" w:hAnsi="Arial" w:cs="Arial"/>
+                <w:b/>
+                <w:bCs/>
+                <w:color w:val="000000" w:themeColor="text1"/>
+                <w:sz w:val="22"/>
+                <w:szCs w:val="22"/>
+              </w:rPr>
+              <w:t xml:space="preserve">Laboratorio #: </w:t>
+            </w:r>
+            <w:proofErr w:type="gramStart"/>
+            <w:r>
+              <w:rPr>
+                <w:rFonts w:ascii="Arial" w:eastAsia="Arial" w:hAnsi="Arial" w:cs="Arial"/>
+                <w:b/>
+                <w:bCs/>
+                <w:color w:val="000000" w:themeColor="text1"/>
+                <w:sz w:val="22"/>
+                <w:szCs w:val="22"/>
+              </w:rPr>
+              <w:t xml:space="preserve">( </w:t>
+            </w:r>
+            <w:r>
+              <w:rPr>
+                <w:rFonts w:ascii="Arial" w:eastAsia="Arial" w:hAnsi="Arial" w:cs="Arial"/>
+                <w:b/>
+                <w:bCs/>
+                <w:color w:val="000000" w:themeColor="text1"/>
+                <w:sz w:val="22"/>
+                <w:szCs w:val="22"/>
+              </w:rPr>
+              <w:t>PAMH</w:t>
+            </w:r>
+            <w:proofErr w:type="gramEnd"/>
+            <w:r>
+              <w:rPr>
+                <w:rFonts w:ascii="Arial" w:eastAsia="Arial" w:hAnsi="Arial" w:cs="Arial"/>
+                <w:b/>
+                <w:bCs/>
+                <w:color w:val="000000" w:themeColor="text1"/>
+                <w:sz w:val="22"/>
+                <w:szCs w:val="22"/>
+              </w:rPr>
+              <w:t>)</w:t>
+            </w:r>
+          </w:p>
+        </w:tc>
+      </w:tr>
+      <w:tr>
+        <w:trPr>
+          <w:trHeight w:val="480"/>
+        </w:trPr>
+        <w:tc>
+          <w:tcPr>
+            <w:tcW w:w="9208" w:type="dxa"/>
+            <w:gridSpan w:val="2"/>
+            <w:tcBorders>
+              <w:top w:val="single" w:sz="8" w:space="0" w:color="000000" w:themeColor="text1"/>
+              <w:left w:val="single" w:sz="8" w:space="0" w:color="000000" w:themeColor="text1"/>
+              <w:bottom w:val="single" w:sz="8" w:space="0" w:color="000000" w:themeColor="text1"/>
+              <w:right w:val="single" w:sz="8" w:space="0" w:color="000000" w:themeColor="text1"/>
+            </w:tcBorders>
+            <w:tcMar>
+              <w:top w:w="100" w:type="dxa"/>
+              <w:left w:w="100" w:type="dxa"/>
+              <w:bottom w:w="100" w:type="dxa"/>
+              <w:right w:w="100" w:type="dxa"/>
+            </w:tcMar>
+          </w:tcPr>
+          <w:p>
+            <w:pPr>
+              <w:spacing w:after="0"/>
+              <w:jc w:val="center"/>
+              <w:rPr>
+                <w:rFonts w:ascii="Arial" w:eastAsia="Arial" w:hAnsi="Arial" w:cs="Arial"/>
+                <w:b/>
+                <w:bCs/>
+                <w:color w:val="000000" w:themeColor="text1"/>
+              </w:rPr>
+            </w:pPr>
+            <w:r>
+              <w:rPr>
+                <w:rFonts w:ascii="Arial" w:eastAsia="Arial" w:hAnsi="Arial" w:cs="Arial"/>
+                <w:b/>
+                <w:bCs/>
+                <w:color w:val="000000" w:themeColor="text1"/>
+              </w:rPr>
+              <w:t>Reporte de actividades</w:t>
+            </w:r>
+          </w:p>
+          <w:p>
+            <w:pPr>
+              <w:spacing w:after="0"/>
+              <w:rPr>
+                <w:rFonts w:ascii="Arial" w:eastAsia="Arial" w:hAnsi="Arial" w:cs="Arial"/>
+                <w:color w:val="000000" w:themeColor="text1"/>
+              </w:rPr>
+            </w:pPr>
+            <w:r>
+              <w:rPr>
+                <w:rFonts w:ascii="Arial" w:eastAsia="Arial" w:hAnsi="Arial" w:cs="Arial"/>
+                <w:b/>
+                <w:bCs/>
+                <w:color w:val="000000" w:themeColor="text1"/>
+              </w:rPr>
+              <w:t xml:space="preserve">Actividad:  </w:t>
+            </w:r>
+            <w:r>
+              <w:rPr>
+                <w:rFonts w:ascii="Arial" w:eastAsia="Arial" w:hAnsi="Arial" w:cs="Arial"/>
+                <w:color w:val="000000" w:themeColor="text1"/>
+              </w:rPr>
+              <w:t>Ajuste controlador PID</w:t>
+            </w:r>
+          </w:p>
+          <w:p>
+            <w:pPr>
+              <w:spacing w:after="0"/>
+            </w:pPr>
+            <w:r>
+              <w:rPr>
+                <w:rFonts w:ascii="Arial" w:eastAsia="Arial" w:hAnsi="Arial" w:cs="Arial"/>
+                <w:color w:val="000000" w:themeColor="text1"/>
+              </w:rPr>
+              <w:t>Se realiza el 24 de Abril el ajuste del controlador PID continuo y discreto.</w:t>
+            </w:r>
+            <w:r>
+              <w:t xml:space="preserve"> </w:t>
+            </w:r>
           </w:p>
         </w:tc>
       </w:tr>
@@ -1710,7 +4529,7 @@
   <w:style w:type="paragraph" w:default="1" w:styleId="Normal">
     <w:name w:val="Normal"/>
     <w:qFormat/>
-    <w:rsid w:val="50B79F51"/>
+    <w:rsid w:val="004A3C7E"/>
     <w:rPr>
       <w:lang w:val="es-CR"/>
     </w:rPr>

</xml_diff>